<commit_message>
actualización guia fisica 2 medio
</commit_message>
<xml_diff>
--- a/ABP_4medio/ABP_rubrica_responsabilidad.docx
+++ b/ABP_4medio/ABP_rubrica_responsabilidad.docx
@@ -1,14 +1,23 @@
 
 <file path=word/document.xml><?xml version="1.0" encoding="utf-8"?>
-<w:document xmlns:w="http://schemas.openxmlformats.org/wordprocessingml/2006/main" xmlns:m="http://schemas.openxmlformats.org/officeDocument/2006/math" xmlns:r="http://schemas.openxmlformats.org/officeDocument/2006/relationships" xmlns:o="urn:schemas-microsoft-com:office:office" xmlns:v="urn:schemas-microsoft-com:vml" xmlns:w10="urn:schemas-microsoft-com:office:word" xmlns:a="http://schemas.openxmlformats.org/drawingml/2006/main" xmlns:pic="http://schemas.openxmlformats.org/drawingml/2006/picture" xmlns:wp="http://schemas.openxmlformats.org/drawingml/2006/wordprocessingDrawing">
+<w:document xmlns:wpc="http://schemas.microsoft.com/office/word/2010/wordprocessingCanvas" xmlns:cx="http://schemas.microsoft.com/office/drawing/2014/chartex" xmlns:cx1="http://schemas.microsoft.com/office/drawing/2015/9/8/chartex" xmlns:cx2="http://schemas.microsoft.com/office/drawing/2015/10/21/chartex" xmlns:cx3="http://schemas.microsoft.com/office/drawing/2016/5/9/chartex" xmlns:cx4="http://schemas.microsoft.com/office/drawing/2016/5/10/chartex" xmlns:cx5="http://schemas.microsoft.com/office/drawing/2016/5/11/chartex" xmlns:cx6="http://schemas.microsoft.com/office/drawing/2016/5/12/chartex" xmlns:cx7="http://schemas.microsoft.com/office/drawing/2016/5/13/chartex" xmlns:cx8="http://schemas.microsoft.com/office/drawing/2016/5/14/chartex" xmlns:mc="http://schemas.openxmlformats.org/markup-compatibility/2006" xmlns:aink="http://schemas.microsoft.com/office/drawing/2016/ink" xmlns:am3d="http://schemas.microsoft.com/office/drawing/2017/model3d" xmlns:o="urn:schemas-microsoft-com:office:office" xmlns:oel="http://schemas.microsoft.com/office/2019/extlst" xmlns:r="http://schemas.openxmlformats.org/officeDocument/2006/relationships" xmlns:m="http://schemas.openxmlformats.org/officeDocument/2006/math" xmlns:v="urn:schemas-microsoft-com:vml" xmlns:wp14="http://schemas.microsoft.com/office/word/2010/wordprocessingDrawing" xmlns:wp="http://schemas.openxmlformats.org/drawingml/2006/wordprocessingDrawing" xmlns:w10="urn:schemas-microsoft-com:office:word" xmlns:w="http://schemas.openxmlformats.org/wordprocessingml/2006/main" xmlns:w14="http://schemas.microsoft.com/office/word/2010/wordml" xmlns:w15="http://schemas.microsoft.com/office/word/2012/wordml" xmlns:w16cex="http://schemas.microsoft.com/office/word/2018/wordml/cex" xmlns:w16cid="http://schemas.microsoft.com/office/word/2016/wordml/cid" xmlns:w16="http://schemas.microsoft.com/office/word/2018/wordml" xmlns:w16du="http://schemas.microsoft.com/office/word/2023/wordml/word16du" xmlns:w16sdtdh="http://schemas.microsoft.com/office/word/2020/wordml/sdtdatahash" xmlns:w16sdtfl="http://schemas.microsoft.com/office/word/2024/wordml/sdtformatlock" xmlns:w16se="http://schemas.microsoft.com/office/word/2015/wordml/symex" xmlns:wpg="http://schemas.microsoft.com/office/word/2010/wordprocessingGroup" xmlns:wpi="http://schemas.microsoft.com/office/word/2010/wordprocessingInk" xmlns:wne="http://schemas.microsoft.com/office/word/2006/wordml" xmlns:wps="http://schemas.microsoft.com/office/word/2010/wordprocessingShape" mc:Ignorable="w14 w15 w16se w16cid w16 w16cex w16sdtdh w16sdtfl w16du wp14">
   <w:body>
-    <w:bookmarkStart w:id="9" w:name="rúbrica-de-responsabilidad-y-proceso-25"/>
     <w:p>
       <w:pPr>
-        <w:pStyle w:val="Heading2"/>
+        <w:pStyle w:val="Ttulo2"/>
+        <w:rPr>
+          <w:color w:val="auto"/>
+        </w:rPr>
       </w:pPr>
+      <w:bookmarkStart w:id="0" w:name="rúbrica-de-responsabilidad-y-proceso-25"/>
       <w:r>
-        <w:t xml:space="preserve">⚖️ Rúbrica de Responsabilidad y Proceso (25%)</w:t>
+        <w:t xml:space="preserve">⚖️ </w:t>
+      </w:r>
+      <w:r>
+        <w:rPr>
+          <w:color w:val="auto"/>
+        </w:rPr>
+        <w:t>Rúbrica de Responsabilidad y Proceso (25%)</w:t>
       </w:r>
     </w:p>
     <w:p>
@@ -20,361 +29,528 @@
           <w:i/>
           <w:iCs/>
         </w:rPr>
-        <w:t xml:space="preserve">Esta pauta es aplicada por todos los docentes de forma transversal. Cada criterio se evalúa de 1 a 4 puntos.</w:t>
+        <w:t>Esta pauta es aplicada por todos los docentes de forma transversal. Cada criterio se evalúa de 1 a 4 puntos.</w:t>
       </w:r>
     </w:p>
     <w:tbl>
       <w:tblPr>
         <w:tblStyle w:val="Table"/>
-        <w:tblW w:type="pct" w:w="5000"/>
+        <w:tblW w:w="5000" w:type="pct"/>
+        <w:tblBorders>
+          <w:top w:val="single" w:sz="4" w:space="0" w:color="auto"/>
+          <w:left w:val="single" w:sz="4" w:space="0" w:color="auto"/>
+          <w:bottom w:val="single" w:sz="4" w:space="0" w:color="auto"/>
+          <w:right w:val="single" w:sz="4" w:space="0" w:color="auto"/>
+          <w:insideH w:val="single" w:sz="4" w:space="0" w:color="auto"/>
+          <w:insideV w:val="single" w:sz="4" w:space="0" w:color="auto"/>
+        </w:tblBorders>
         <w:tblLayout w:type="fixed"/>
-        <w:tblLook w:firstRow="1" w:lastRow="0" w:firstColumn="0" w:lastColumn="0" w:noHBand="0" w:noVBand="0" w:val="0020"/>
+        <w:tblLook w:val="0020" w:firstRow="1" w:lastRow="0" w:firstColumn="0" w:lastColumn="0" w:noHBand="0" w:noVBand="0"/>
       </w:tblPr>
       <w:tblGrid>
-        <w:gridCol w:w="1980"/>
-        <w:gridCol w:w="1980"/>
-        <w:gridCol w:w="1980"/>
-        <w:gridCol w:w="1980"/>
+        <w:gridCol w:w="2263"/>
+        <w:gridCol w:w="2263"/>
+        <w:gridCol w:w="2264"/>
+        <w:gridCol w:w="2264"/>
       </w:tblGrid>
       <w:tr>
         <w:trPr>
-          <w:tblHeader w:val="on"/>
+          <w:cnfStyle w:val="100000000000" w:firstRow="1" w:lastRow="0" w:firstColumn="0" w:lastColumn="0" w:oddVBand="0" w:evenVBand="0" w:oddHBand="0" w:evenHBand="0" w:firstRowFirstColumn="0" w:firstRowLastColumn="0" w:lastRowFirstColumn="0" w:lastRowLastColumn="0"/>
+          <w:tblHeader/>
         </w:trPr>
         <w:tc>
-          <w:tcPr/>
+          <w:tcPr>
+            <w:tcW w:w="1980" w:type="dxa"/>
+          </w:tcPr>
           <w:p>
             <w:pPr>
               <w:pStyle w:val="Compact"/>
-              <w:jc w:val="left"/>
             </w:pPr>
             <w:r>
-              <w:t xml:space="preserve">Criterio</w:t>
+              <w:t>Criterio</w:t>
             </w:r>
           </w:p>
         </w:tc>
         <w:tc>
-          <w:tcPr/>
+          <w:tcPr>
+            <w:tcW w:w="1980" w:type="dxa"/>
+          </w:tcPr>
           <w:p>
             <w:pPr>
               <w:pStyle w:val="Compact"/>
-              <w:jc w:val="left"/>
             </w:pPr>
             <w:r>
-              <w:t xml:space="preserve">Destacado (4 pts)</w:t>
+              <w:t>Destacado (4 pts)</w:t>
             </w:r>
           </w:p>
         </w:tc>
         <w:tc>
-          <w:tcPr/>
+          <w:tcPr>
+            <w:tcW w:w="1980" w:type="dxa"/>
+          </w:tcPr>
           <w:p>
             <w:pPr>
               <w:pStyle w:val="Compact"/>
-              <w:jc w:val="left"/>
             </w:pPr>
             <w:r>
-              <w:t xml:space="preserve">Habilitado (3 pts)</w:t>
+              <w:t>Habilitado (3 pts)</w:t>
             </w:r>
           </w:p>
         </w:tc>
         <w:tc>
-          <w:tcPr/>
+          <w:tcPr>
+            <w:tcW w:w="1980" w:type="dxa"/>
+          </w:tcPr>
           <w:p>
             <w:pPr>
               <w:pStyle w:val="Compact"/>
-              <w:jc w:val="left"/>
             </w:pPr>
             <w:r>
-              <w:t xml:space="preserve">Inicial (1 pt)</w:t>
+              <w:t>Inicial (1 pt)</w:t>
             </w:r>
           </w:p>
         </w:tc>
       </w:tr>
       <w:tr>
         <w:tc>
-          <w:tcPr/>
+          <w:tcPr>
+            <w:tcW w:w="1980" w:type="dxa"/>
+          </w:tcPr>
           <w:p>
             <w:pPr>
               <w:pStyle w:val="Compact"/>
-              <w:jc w:val="left"/>
             </w:pPr>
             <w:r>
               <w:rPr>
                 <w:b/>
                 <w:bCs/>
               </w:rPr>
-              <w:t xml:space="preserve">Registro de Firmas (Bitácora)</w:t>
+              <w:t xml:space="preserve">Registro de </w:t>
+            </w:r>
+            <w:proofErr w:type="spellStart"/>
+            <w:r>
+              <w:rPr>
+                <w:b/>
+                <w:bCs/>
+              </w:rPr>
+              <w:t>Firmas</w:t>
+            </w:r>
+            <w:proofErr w:type="spellEnd"/>
+            <w:r>
+              <w:rPr>
+                <w:b/>
+                <w:bCs/>
+              </w:rPr>
+              <w:t xml:space="preserve"> (</w:t>
+            </w:r>
+            <w:proofErr w:type="spellStart"/>
+            <w:r>
+              <w:rPr>
+                <w:b/>
+                <w:bCs/>
+              </w:rPr>
+              <w:t>Bitácora</w:t>
+            </w:r>
+            <w:proofErr w:type="spellEnd"/>
+            <w:r>
+              <w:rPr>
+                <w:b/>
+                <w:bCs/>
+              </w:rPr>
+              <w:t>)</w:t>
             </w:r>
           </w:p>
         </w:tc>
         <w:tc>
-          <w:tcPr/>
+          <w:tcPr>
+            <w:tcW w:w="1980" w:type="dxa"/>
+          </w:tcPr>
           <w:p>
             <w:pPr>
               <w:pStyle w:val="Compact"/>
-              <w:jc w:val="left"/>
             </w:pPr>
             <w:r>
-              <w:t xml:space="preserve">Cuenta con las 11 firmas docentes que validan el trabajo realizado hora a hora.</w:t>
+              <w:t>Cuenta con las 11 firmas docentes que validan el trabajo realizado hora a hora.</w:t>
             </w:r>
           </w:p>
         </w:tc>
         <w:tc>
-          <w:tcPr/>
+          <w:tcPr>
+            <w:tcW w:w="1980" w:type="dxa"/>
+          </w:tcPr>
           <w:p>
             <w:pPr>
               <w:pStyle w:val="Compact"/>
-              <w:jc w:val="left"/>
             </w:pPr>
             <w:r>
-              <w:t xml:space="preserve">Cuenta con 8 a 10 firmas docentes en la bitácora.</w:t>
+              <w:t>Cuenta con 8 a 10 firmas docentes en la bitácora.</w:t>
             </w:r>
           </w:p>
         </w:tc>
         <w:tc>
-          <w:tcPr/>
+          <w:tcPr>
+            <w:tcW w:w="1980" w:type="dxa"/>
+          </w:tcPr>
           <w:p>
             <w:pPr>
               <w:pStyle w:val="Compact"/>
-              <w:jc w:val="left"/>
             </w:pPr>
             <w:r>
-              <w:t xml:space="preserve">Cuenta con menos de 8 firmas o la bitácora no está consignada.</w:t>
+              <w:t>Cuenta con menos de 8 firmas o la bitácora no está consignada.</w:t>
             </w:r>
           </w:p>
         </w:tc>
       </w:tr>
       <w:tr>
         <w:tc>
-          <w:tcPr/>
+          <w:tcPr>
+            <w:tcW w:w="1980" w:type="dxa"/>
+          </w:tcPr>
           <w:p>
             <w:pPr>
               <w:pStyle w:val="Compact"/>
-              <w:jc w:val="left"/>
             </w:pPr>
+            <w:proofErr w:type="spellStart"/>
             <w:r>
               <w:rPr>
                 <w:b/>
                 <w:bCs/>
               </w:rPr>
-              <w:t xml:space="preserve">Gestión de la Carpeta</w:t>
-            </w:r>
+              <w:t>Gestión</w:t>
+            </w:r>
+            <w:proofErr w:type="spellEnd"/>
+            <w:r>
+              <w:rPr>
+                <w:b/>
+                <w:bCs/>
+              </w:rPr>
+              <w:t xml:space="preserve"> de la </w:t>
+            </w:r>
+            <w:proofErr w:type="spellStart"/>
+            <w:r>
+              <w:rPr>
+                <w:b/>
+                <w:bCs/>
+              </w:rPr>
+              <w:t>Carpeta</w:t>
+            </w:r>
+            <w:proofErr w:type="spellEnd"/>
           </w:p>
         </w:tc>
         <w:tc>
-          <w:tcPr/>
+          <w:tcPr>
+            <w:tcW w:w="1980" w:type="dxa"/>
+          </w:tcPr>
           <w:p>
             <w:pPr>
               <w:pStyle w:val="Compact"/>
-              <w:jc w:val="left"/>
             </w:pPr>
             <w:r>
-              <w:t xml:space="preserve">La carpeta contiene todas las evidencias técnicas (Guías 1 a 6) ordenadas y completas.</w:t>
+              <w:t>La carpeta contiene todas las evidencias técnicas (Guías 1 a 6) ordenadas y completas.</w:t>
             </w:r>
           </w:p>
         </w:tc>
         <w:tc>
-          <w:tcPr/>
+          <w:tcPr>
+            <w:tcW w:w="1980" w:type="dxa"/>
+          </w:tcPr>
           <w:p>
             <w:pPr>
               <w:pStyle w:val="Compact"/>
-              <w:jc w:val="left"/>
             </w:pPr>
             <w:r>
-              <w:t xml:space="preserve">La carpeta está presente, pero faltan 1 o 2 evidencias técnicas o están desordenadas.</w:t>
+              <w:t>La carpeta está presente, pero faltan 1 o 2 evidencias técnicas o están desordenadas.</w:t>
             </w:r>
           </w:p>
         </w:tc>
         <w:tc>
-          <w:tcPr/>
+          <w:tcPr>
+            <w:tcW w:w="1980" w:type="dxa"/>
+          </w:tcPr>
           <w:p>
             <w:pPr>
               <w:pStyle w:val="Compact"/>
-              <w:jc w:val="left"/>
             </w:pPr>
             <w:r>
-              <w:t xml:space="preserve">La carpeta está incompleta, sucia o faltan la mayoría de las evidencias técnicas.</w:t>
+              <w:t>La carpeta está incompleta, sucia o faltan la mayoría de las evidencias técnicas.</w:t>
             </w:r>
           </w:p>
         </w:tc>
       </w:tr>
       <w:tr>
         <w:tc>
-          <w:tcPr/>
+          <w:tcPr>
+            <w:tcW w:w="1980" w:type="dxa"/>
+          </w:tcPr>
           <w:p>
             <w:pPr>
               <w:pStyle w:val="Compact"/>
-              <w:jc w:val="left"/>
             </w:pPr>
+            <w:proofErr w:type="spellStart"/>
             <w:r>
               <w:rPr>
                 <w:b/>
                 <w:bCs/>
               </w:rPr>
-              <w:t xml:space="preserve">Desempeño de Roles</w:t>
+              <w:t>Desempeño</w:t>
+            </w:r>
+            <w:proofErr w:type="spellEnd"/>
+            <w:r>
+              <w:rPr>
+                <w:b/>
+                <w:bCs/>
+              </w:rPr>
+              <w:t xml:space="preserve"> de Roles</w:t>
             </w:r>
           </w:p>
         </w:tc>
         <w:tc>
-          <w:tcPr/>
+          <w:tcPr>
+            <w:tcW w:w="1980" w:type="dxa"/>
+          </w:tcPr>
           <w:p>
             <w:pPr>
               <w:pStyle w:val="Compact"/>
-              <w:jc w:val="left"/>
             </w:pPr>
             <w:r>
-              <w:t xml:space="preserve">Cada integrante (Representante, Subrogante, Secretario) cumple rigurosamente con sus funciones asignadas.</w:t>
+              <w:t>Cada integrante (Representante, Subrogante, Secretario) cumple rigurosamente con sus funciones asignadas.</w:t>
             </w:r>
           </w:p>
         </w:tc>
         <w:tc>
-          <w:tcPr/>
+          <w:tcPr>
+            <w:tcW w:w="1980" w:type="dxa"/>
+          </w:tcPr>
           <w:p>
             <w:pPr>
               <w:pStyle w:val="Compact"/>
-              <w:jc w:val="left"/>
             </w:pPr>
-            <w:r>
-              <w:t xml:space="preserve">Los roles están asignados, pero se observa confusión o falta de autonomía en algunas tareas.</w:t>
+            <w:proofErr w:type="gramStart"/>
+            <w:r>
+              <w:t>Los</w:t>
+            </w:r>
+            <w:proofErr w:type="gramEnd"/>
+            <w:r>
+              <w:t xml:space="preserve"> roles están asignados, pero se observa confusión o falta de autonomía en algunas tareas.</w:t>
             </w:r>
           </w:p>
         </w:tc>
         <w:tc>
-          <w:tcPr/>
+          <w:tcPr>
+            <w:tcW w:w="1980" w:type="dxa"/>
+          </w:tcPr>
           <w:p>
             <w:pPr>
               <w:pStyle w:val="Compact"/>
-              <w:jc w:val="left"/>
             </w:pPr>
             <w:r>
-              <w:t xml:space="preserve">No existe una división de tareas clara y los integrantes no asumen sus responsabilidades.</w:t>
+              <w:t>No existe una división de tareas clara y los integrantes no asumen sus responsabilidades.</w:t>
             </w:r>
           </w:p>
         </w:tc>
       </w:tr>
       <w:tr>
         <w:tc>
-          <w:tcPr/>
+          <w:tcPr>
+            <w:tcW w:w="1980" w:type="dxa"/>
+          </w:tcPr>
           <w:p>
             <w:pPr>
               <w:pStyle w:val="Compact"/>
-              <w:jc w:val="left"/>
             </w:pPr>
             <w:r>
               <w:rPr>
                 <w:b/>
                 <w:bCs/>
               </w:rPr>
-              <w:t xml:space="preserve">Uso de Recursos</w:t>
-            </w:r>
+              <w:t xml:space="preserve">Uso de </w:t>
+            </w:r>
+            <w:proofErr w:type="spellStart"/>
+            <w:r>
+              <w:rPr>
+                <w:b/>
+                <w:bCs/>
+              </w:rPr>
+              <w:t>Recursos</w:t>
+            </w:r>
+            <w:proofErr w:type="spellEnd"/>
           </w:p>
         </w:tc>
         <w:tc>
-          <w:tcPr/>
+          <w:tcPr>
+            <w:tcW w:w="1980" w:type="dxa"/>
+          </w:tcPr>
           <w:p>
             <w:pPr>
               <w:pStyle w:val="Compact"/>
-              <w:jc w:val="left"/>
             </w:pPr>
             <w:r>
-              <w:t xml:space="preserve">Utiliza y cuida los materiales de forma óptima.</w:t>
+              <w:t>Utiliza y cuida los materiales de forma óptima.</w:t>
             </w:r>
           </w:p>
         </w:tc>
         <w:tc>
-          <w:tcPr/>
+          <w:tcPr>
+            <w:tcW w:w="1980" w:type="dxa"/>
+          </w:tcPr>
           <w:p>
             <w:pPr>
               <w:pStyle w:val="Compact"/>
-              <w:jc w:val="left"/>
             </w:pPr>
             <w:r>
-              <w:t xml:space="preserve">Utiliza los recursos adecuadamente, pero con desorden ocasional en el espacio de trabajo.</w:t>
+              <w:t>Utiliza los recursos adecuadamente, pero con desorden ocasional en el espacio de trabajo.</w:t>
             </w:r>
           </w:p>
         </w:tc>
         <w:tc>
-          <w:tcPr/>
+          <w:tcPr>
+            <w:tcW w:w="1980" w:type="dxa"/>
+          </w:tcPr>
           <w:p>
             <w:pPr>
               <w:pStyle w:val="Compact"/>
-              <w:jc w:val="left"/>
             </w:pPr>
             <w:r>
-              <w:t xml:space="preserve">Hace mal uso de los materiales o herramientas digitales, poniendo en riesgo el equipo.</w:t>
+              <w:t>Hace mal uso de los materiales o herramientas digitales, poniendo en riesgo el equipo.</w:t>
             </w:r>
           </w:p>
         </w:tc>
       </w:tr>
       <w:tr>
         <w:tc>
-          <w:tcPr/>
+          <w:tcPr>
+            <w:tcW w:w="1980" w:type="dxa"/>
+          </w:tcPr>
           <w:p>
             <w:pPr>
               <w:pStyle w:val="Compact"/>
-              <w:jc w:val="left"/>
             </w:pPr>
+            <w:proofErr w:type="spellStart"/>
             <w:r>
               <w:rPr>
                 <w:b/>
                 <w:bCs/>
               </w:rPr>
-              <w:t xml:space="preserve">Puntualidad en Avances</w:t>
-            </w:r>
+              <w:t>Puntualidad</w:t>
+            </w:r>
+            <w:proofErr w:type="spellEnd"/>
+            <w:r>
+              <w:rPr>
+                <w:b/>
+                <w:bCs/>
+              </w:rPr>
+              <w:t xml:space="preserve"> </w:t>
+            </w:r>
+            <w:proofErr w:type="spellStart"/>
+            <w:r>
+              <w:rPr>
+                <w:b/>
+                <w:bCs/>
+              </w:rPr>
+              <w:t>en</w:t>
+            </w:r>
+            <w:proofErr w:type="spellEnd"/>
+            <w:r>
+              <w:rPr>
+                <w:b/>
+                <w:bCs/>
+              </w:rPr>
+              <w:t xml:space="preserve"> </w:t>
+            </w:r>
+            <w:proofErr w:type="spellStart"/>
+            <w:r>
+              <w:rPr>
+                <w:b/>
+                <w:bCs/>
+              </w:rPr>
+              <w:t>Avances</w:t>
+            </w:r>
+            <w:proofErr w:type="spellEnd"/>
           </w:p>
         </w:tc>
         <w:tc>
-          <w:tcPr/>
+          <w:tcPr>
+            <w:tcW w:w="1980" w:type="dxa"/>
+          </w:tcPr>
           <w:p>
             <w:pPr>
               <w:pStyle w:val="Compact"/>
-              <w:jc w:val="left"/>
             </w:pPr>
             <w:r>
-              <w:t xml:space="preserve">Cumple con la entrega del Producto Final y los hitos intermedios en los plazos establecidos.</w:t>
+              <w:t>Cumple con la entrega del Producto Final y los hitos intermedios en los plazos establecidos.</w:t>
             </w:r>
           </w:p>
         </w:tc>
         <w:tc>
-          <w:tcPr/>
+          <w:tcPr>
+            <w:tcW w:w="1980" w:type="dxa"/>
+          </w:tcPr>
           <w:p>
             <w:pPr>
               <w:pStyle w:val="Compact"/>
-              <w:jc w:val="left"/>
             </w:pPr>
             <w:r>
-              <w:t xml:space="preserve">Entrega con un retraso menor (máximo 1 día) con justificación previa.</w:t>
+              <w:t>Entrega con un retraso menor (máximo 1 día) con justificación previa.</w:t>
             </w:r>
           </w:p>
         </w:tc>
         <w:tc>
-          <w:tcPr/>
+          <w:tcPr>
+            <w:tcW w:w="1980" w:type="dxa"/>
+          </w:tcPr>
           <w:p>
             <w:pPr>
               <w:pStyle w:val="Compact"/>
-              <w:jc w:val="left"/>
             </w:pPr>
             <w:r>
-              <w:t xml:space="preserve">Entrega fuera de plazo sin justificación o el trabajo es insuficiente.</w:t>
+              <w:t>Entrega fuera de plazo sin justificación o el trabajo es insuficiente.</w:t>
             </w:r>
           </w:p>
         </w:tc>
       </w:tr>
     </w:tbl>
     <w:p>
+      <w:pPr>
+        <w:pStyle w:val="Ttulo2"/>
+        <w:rPr>
+          <w:color w:val="auto"/>
+        </w:rPr>
+      </w:pPr>
+      <w:bookmarkStart w:id="1" w:name="resumen-de-calificación-final"/>
+      <w:bookmarkEnd w:id="0"/>
       <w:r>
-        <w:pict>
-          <v:rect style="width:0;height:1.5pt" o:hralign="center" o:hrstd="t" o:hr="t"/>
-        </w:pict>
+        <w:rPr>
+          <w:color w:val="auto"/>
+        </w:rPr>
+        <w:t xml:space="preserve">📈 </w:t>
       </w:r>
-    </w:p>
-    <w:bookmarkEnd w:id="9"/>
-    <w:bookmarkStart w:id="10" w:name="resumen-de-calificación-final"/>
-    <w:p>
-      <w:pPr>
-        <w:pStyle w:val="Heading2"/>
-      </w:pPr>
+      <w:proofErr w:type="spellStart"/>
       <w:r>
-        <w:t xml:space="preserve">📈 Resumen de Calificación Final</w:t>
+        <w:rPr>
+          <w:color w:val="auto"/>
+        </w:rPr>
+        <w:t>Resumen</w:t>
+      </w:r>
+      <w:proofErr w:type="spellEnd"/>
+      <w:r>
+        <w:rPr>
+          <w:color w:val="auto"/>
+        </w:rPr>
+        <w:t xml:space="preserve"> de </w:t>
+      </w:r>
+      <w:proofErr w:type="spellStart"/>
+      <w:r>
+        <w:rPr>
+          <w:color w:val="auto"/>
+        </w:rPr>
+        <w:t>Calificación</w:t>
+      </w:r>
+      <w:proofErr w:type="spellEnd"/>
+      <w:r>
+        <w:rPr>
+          <w:color w:val="auto"/>
+        </w:rPr>
+        <w:t xml:space="preserve"> Final</w:t>
       </w:r>
     </w:p>
     <w:p>
@@ -382,23 +558,23 @@
         <w:pStyle w:val="FirstParagraph"/>
       </w:pPr>
       <w:r>
-        <w:t xml:space="preserve">Para cada asignatura</w:t>
-      </w:r>
-      <w:r>
-        <w:t xml:space="preserve"> </w:t>
+        <w:t xml:space="preserve">Para cada asignatura </w:t>
       </w:r>
       <m:oMath>
         <m:r>
+          <w:rPr>
+            <w:rFonts w:ascii="Cambria Math" w:hAnsi="Cambria Math"/>
+          </w:rPr>
           <m:t>n</m:t>
         </m:r>
       </m:oMath>
       <w:r>
-        <w:t xml:space="preserve">, la nota se calcula considerando el 75% del desempeño técnico en las guías y el 25% de esta rúbrica de responsabilidad:</w:t>
+        <w:t>, la nota se calcula considerando el 75% del desempeño técnico en las guías y el 25% de esta rúbrica de responsabilidad:</w:t>
       </w:r>
     </w:p>
     <w:p>
       <w:pPr>
-        <w:pStyle w:val="BodyText"/>
+        <w:pStyle w:val="Textoindependiente"/>
       </w:pPr>
       <m:oMathPara>
         <m:oMathParaPr>
@@ -406,50 +582,33 @@
         </m:oMathParaPr>
         <m:oMath>
           <m:r>
-            <m:t>N</m:t>
-          </m:r>
-          <m:r>
-            <m:t>o</m:t>
-          </m:r>
-          <m:r>
-            <m:t>t</m:t>
+            <w:rPr>
+              <w:rFonts w:ascii="Cambria Math" w:hAnsi="Cambria Math"/>
+            </w:rPr>
+            <m:t>Not</m:t>
           </m:r>
           <m:sSub>
+            <m:sSubPr>
+              <m:ctrlPr>
+                <w:rPr>
+                  <w:rFonts w:ascii="Cambria Math" w:hAnsi="Cambria Math"/>
+                </w:rPr>
+              </m:ctrlPr>
+            </m:sSubPr>
             <m:e>
               <m:r>
+                <w:rPr>
+                  <w:rFonts w:ascii="Cambria Math" w:hAnsi="Cambria Math"/>
+                </w:rPr>
                 <m:t>a</m:t>
               </m:r>
             </m:e>
             <m:sub>
               <m:r>
-                <m:t>A</m:t>
-              </m:r>
-              <m:r>
-                <m:t>s</m:t>
-              </m:r>
-              <m:r>
-                <m:t>i</m:t>
-              </m:r>
-              <m:r>
-                <m:t>g</m:t>
-              </m:r>
-              <m:r>
-                <m:t>n</m:t>
-              </m:r>
-              <m:r>
-                <m:t>a</m:t>
-              </m:r>
-              <m:r>
-                <m:t>t</m:t>
-              </m:r>
-              <m:r>
-                <m:t>u</m:t>
-              </m:r>
-              <m:r>
-                <m:t>r</m:t>
-              </m:r>
-              <m:r>
-                <m:t>a</m:t>
+                <w:rPr>
+                  <w:rFonts w:ascii="Cambria Math" w:hAnsi="Cambria Math"/>
+                </w:rPr>
+                <m:t>Asignatura</m:t>
               </m:r>
             </m:sub>
           </m:sSub>
@@ -457,217 +616,153 @@
             <m:rPr>
               <m:sty m:val="p"/>
             </m:rPr>
-            <m:t>=</m:t>
+            <w:rPr>
+              <w:rFonts w:ascii="Cambria Math" w:hAnsi="Cambria Math"/>
+            </w:rPr>
+            <m:t>=(</m:t>
+          </m:r>
+          <m:r>
+            <w:rPr>
+              <w:rFonts w:ascii="Cambria Math" w:hAnsi="Cambria Math"/>
+            </w:rPr>
+            <m:t>Nota</m:t>
           </m:r>
           <m:r>
             <m:rPr>
               <m:sty m:val="p"/>
             </m:rPr>
-            <m:t>(</m:t>
+            <w:rPr>
+              <w:rFonts w:ascii="Cambria Math" w:hAnsi="Cambria Math"/>
+            </w:rPr>
+            <m:t>_</m:t>
           </m:r>
           <m:r>
-            <m:t>N</m:t>
-          </m:r>
-          <m:r>
-            <m:t>o</m:t>
-          </m:r>
-          <m:r>
-            <m:t>t</m:t>
-          </m:r>
-          <m:r>
-            <m:t>a</m:t>
+            <w:rPr>
+              <w:rFonts w:ascii="Cambria Math" w:hAnsi="Cambria Math"/>
+            </w:rPr>
+            <m:t>Técnica</m:t>
           </m:r>
           <m:r>
             <m:rPr>
               <m:sty m:val="p"/>
             </m:rPr>
-            <m:t>_</m:t>
-          </m:r>
-          <m:r>
-            <m:t>T</m:t>
-          </m:r>
-          <m:r>
-            <m:t>é</m:t>
-          </m:r>
-          <m:r>
-            <m:t>c</m:t>
-          </m:r>
-          <m:r>
-            <m:t>n</m:t>
-          </m:r>
-          <m:r>
-            <m:t>i</m:t>
-          </m:r>
-          <m:r>
-            <m:t>c</m:t>
-          </m:r>
-          <m:r>
-            <m:t>a</m:t>
-          </m:r>
-          <m:r>
-            <m:rPr>
-              <m:sty m:val="p"/>
-            </m:rPr>
+            <w:rPr>
+              <w:rFonts w:ascii="Cambria Math" w:hAnsi="Cambria Math"/>
+            </w:rPr>
             <m:t>⋅</m:t>
           </m:r>
           <m:r>
+            <w:rPr>
+              <w:rFonts w:ascii="Cambria Math" w:hAnsi="Cambria Math"/>
+            </w:rPr>
             <m:t>0</m:t>
           </m:r>
           <m:r>
             <m:rPr>
               <m:sty m:val="p"/>
             </m:rPr>
+            <w:rPr>
+              <w:rFonts w:ascii="Cambria Math" w:hAnsi="Cambria Math"/>
+            </w:rPr>
             <m:t>,</m:t>
           </m:r>
           <m:r>
+            <w:rPr>
+              <w:rFonts w:ascii="Cambria Math" w:hAnsi="Cambria Math"/>
+            </w:rPr>
             <m:t>75</m:t>
           </m:r>
           <m:r>
             <m:rPr>
               <m:sty m:val="p"/>
             </m:rPr>
-            <m:t>)</m:t>
+            <w:rPr>
+              <w:rFonts w:ascii="Cambria Math" w:hAnsi="Cambria Math"/>
+            </w:rPr>
+            <m:t>)+(</m:t>
+          </m:r>
+          <m:r>
+            <w:rPr>
+              <w:rFonts w:ascii="Cambria Math" w:hAnsi="Cambria Math"/>
+            </w:rPr>
+            <m:t>Nota</m:t>
           </m:r>
           <m:r>
             <m:rPr>
               <m:sty m:val="p"/>
             </m:rPr>
-            <m:t>+</m:t>
+            <w:rPr>
+              <w:rFonts w:ascii="Cambria Math" w:hAnsi="Cambria Math"/>
+            </w:rPr>
+            <m:t>_</m:t>
+          </m:r>
+          <m:r>
+            <w:rPr>
+              <w:rFonts w:ascii="Cambria Math" w:hAnsi="Cambria Math"/>
+            </w:rPr>
+            <m:t>Responsabilidad</m:t>
           </m:r>
           <m:r>
             <m:rPr>
               <m:sty m:val="p"/>
             </m:rPr>
-            <m:t>(</m:t>
-          </m:r>
-          <m:r>
-            <m:t>N</m:t>
-          </m:r>
-          <m:r>
-            <m:t>o</m:t>
-          </m:r>
-          <m:r>
-            <m:t>t</m:t>
-          </m:r>
-          <m:r>
-            <m:t>a</m:t>
-          </m:r>
-          <m:r>
-            <m:rPr>
-              <m:sty m:val="p"/>
-            </m:rPr>
-            <m:t>_</m:t>
-          </m:r>
-          <m:r>
-            <m:t>R</m:t>
-          </m:r>
-          <m:r>
-            <m:t>e</m:t>
-          </m:r>
-          <m:r>
-            <m:t>s</m:t>
-          </m:r>
-          <m:r>
-            <m:t>p</m:t>
-          </m:r>
-          <m:r>
-            <m:t>o</m:t>
-          </m:r>
-          <m:r>
-            <m:t>n</m:t>
-          </m:r>
-          <m:r>
-            <m:t>s</m:t>
-          </m:r>
-          <m:r>
-            <m:t>a</m:t>
-          </m:r>
-          <m:r>
-            <m:t>b</m:t>
-          </m:r>
-          <m:r>
-            <m:t>i</m:t>
-          </m:r>
-          <m:r>
-            <m:t>l</m:t>
-          </m:r>
-          <m:r>
-            <m:t>i</m:t>
-          </m:r>
-          <m:r>
-            <m:t>d</m:t>
-          </m:r>
-          <m:r>
-            <m:t>a</m:t>
-          </m:r>
-          <m:r>
-            <m:t>d</m:t>
-          </m:r>
-          <m:r>
-            <m:rPr>
-              <m:sty m:val="p"/>
-            </m:rPr>
+            <w:rPr>
+              <w:rFonts w:ascii="Cambria Math" w:hAnsi="Cambria Math"/>
+            </w:rPr>
             <m:t>⋅</m:t>
           </m:r>
           <m:r>
+            <w:rPr>
+              <w:rFonts w:ascii="Cambria Math" w:hAnsi="Cambria Math"/>
+            </w:rPr>
             <m:t>0</m:t>
           </m:r>
           <m:r>
             <m:rPr>
               <m:sty m:val="p"/>
             </m:rPr>
+            <w:rPr>
+              <w:rFonts w:ascii="Cambria Math" w:hAnsi="Cambria Math"/>
+            </w:rPr>
             <m:t>,</m:t>
           </m:r>
           <m:r>
+            <w:rPr>
+              <w:rFonts w:ascii="Cambria Math" w:hAnsi="Cambria Math"/>
+            </w:rPr>
             <m:t>25</m:t>
           </m:r>
           <m:r>
             <m:rPr>
               <m:sty m:val="p"/>
             </m:rPr>
+            <w:rPr>
+              <w:rFonts w:ascii="Cambria Math" w:hAnsi="Cambria Math"/>
+            </w:rPr>
             <m:t>)</m:t>
           </m:r>
         </m:oMath>
       </m:oMathPara>
+      <w:bookmarkEnd w:id="1"/>
     </w:p>
-    <w:bookmarkEnd w:id="10"/>
     <w:sectPr>
       <w:footnotePr>
         <w:numRestart w:val="eachSect"/>
       </w:footnotePr>
+      <w:pgSz w:w="12240" w:h="15840"/>
+      <w:pgMar w:top="1417" w:right="1701" w:bottom="1417" w:left="1701" w:header="720" w:footer="720" w:gutter="0"/>
+      <w:cols w:space="720"/>
     </w:sectPr>
   </w:body>
 </w:document>
 </file>
 
-<file path=word/comments.xml><?xml version="1.0" encoding="utf-8"?>
-<w:comments xmlns:w="http://schemas.openxmlformats.org/wordprocessingml/2006/main" xmlns:m="http://schemas.openxmlformats.org/officeDocument/2006/math" xmlns:r="http://schemas.openxmlformats.org/officeDocument/2006/relationships" xmlns:o="urn:schemas-microsoft-com:office:office" xmlns:v="urn:schemas-microsoft-com:vml" xmlns:w10="urn:schemas-microsoft-com:office:word" xmlns:a="http://schemas.openxmlformats.org/drawingml/2006/main" xmlns:pic="http://schemas.openxmlformats.org/drawingml/2006/picture" xmlns:wp="http://schemas.openxmlformats.org/drawingml/2006/wordprocessingDrawing"/>
-</file>
-
-<file path=word/footnotes.xml><?xml version="1.0" encoding="utf-8"?>
-<w:footnotes xmlns:w="http://schemas.openxmlformats.org/wordprocessingml/2006/main" xmlns:m="http://schemas.openxmlformats.org/officeDocument/2006/math" xmlns:r="http://schemas.openxmlformats.org/officeDocument/2006/relationships" xmlns:o="urn:schemas-microsoft-com:office:office" xmlns:v="urn:schemas-microsoft-com:vml" xmlns:w10="urn:schemas-microsoft-com:office:word" xmlns:a="http://schemas.openxmlformats.org/drawingml/2006/main" xmlns:pic="http://schemas.openxmlformats.org/drawingml/2006/picture" xmlns:wp="http://schemas.openxmlformats.org/drawingml/2006/wordprocessingDrawing">
-  <w:footnote w:type="continuationSeparator" w:id="0">
-    <w:p>
-      <w:r>
-        <w:continuationSeparator/>
-      </w:r>
-    </w:p>
-  </w:footnote>
-  <w:footnote w:type="separator" w:id="-1">
-    <w:p>
-      <w:r>
-        <w:separator/>
-      </w:r>
-    </w:p>
-  </w:footnote>
-</w:footnotes>
-</file>
-
 <file path=word/numbering.xml><?xml version="1.0" encoding="utf-8"?>
-<w:numbering xmlns:w="http://schemas.openxmlformats.org/wordprocessingml/2006/main">
-  <w:abstractNum w:abstractNumId="990">
+<w:numbering xmlns:wpc="http://schemas.microsoft.com/office/word/2010/wordprocessingCanvas" xmlns:cx="http://schemas.microsoft.com/office/drawing/2014/chartex" xmlns:cx1="http://schemas.microsoft.com/office/drawing/2015/9/8/chartex" xmlns:cx2="http://schemas.microsoft.com/office/drawing/2015/10/21/chartex" xmlns:cx3="http://schemas.microsoft.com/office/drawing/2016/5/9/chartex" xmlns:cx4="http://schemas.microsoft.com/office/drawing/2016/5/10/chartex" xmlns:cx5="http://schemas.microsoft.com/office/drawing/2016/5/11/chartex" xmlns:cx6="http://schemas.microsoft.com/office/drawing/2016/5/12/chartex" xmlns:cx7="http://schemas.microsoft.com/office/drawing/2016/5/13/chartex" xmlns:cx8="http://schemas.microsoft.com/office/drawing/2016/5/14/chartex" xmlns:mc="http://schemas.openxmlformats.org/markup-compatibility/2006" xmlns:aink="http://schemas.microsoft.com/office/drawing/2016/ink" xmlns:am3d="http://schemas.microsoft.com/office/drawing/2017/model3d" xmlns:o="urn:schemas-microsoft-com:office:office" xmlns:oel="http://schemas.microsoft.com/office/2019/extlst" xmlns:r="http://schemas.openxmlformats.org/officeDocument/2006/relationships" xmlns:m="http://schemas.openxmlformats.org/officeDocument/2006/math" xmlns:v="urn:schemas-microsoft-com:vml" xmlns:wp14="http://schemas.microsoft.com/office/word/2010/wordprocessingDrawing" xmlns:wp="http://schemas.openxmlformats.org/drawingml/2006/wordprocessingDrawing" xmlns:w10="urn:schemas-microsoft-com:office:word" xmlns:w="http://schemas.openxmlformats.org/wordprocessingml/2006/main" xmlns:w14="http://schemas.microsoft.com/office/word/2010/wordml" xmlns:w15="http://schemas.microsoft.com/office/word/2012/wordml" xmlns:w16cex="http://schemas.microsoft.com/office/word/2018/wordml/cex" xmlns:w16cid="http://schemas.microsoft.com/office/word/2016/wordml/cid" xmlns:w16="http://schemas.microsoft.com/office/word/2018/wordml" xmlns:w16du="http://schemas.microsoft.com/office/word/2023/wordml/word16du" xmlns:w16sdtdh="http://schemas.microsoft.com/office/word/2020/wordml/sdtdatahash" xmlns:w16sdtfl="http://schemas.microsoft.com/office/word/2024/wordml/sdtformatlock" xmlns:w16se="http://schemas.microsoft.com/office/word/2015/wordml/symex" xmlns:wpg="http://schemas.microsoft.com/office/word/2010/wordprocessingGroup" xmlns:wpi="http://schemas.microsoft.com/office/word/2010/wordprocessingInk" xmlns:wne="http://schemas.microsoft.com/office/word/2006/wordml" xmlns:wps="http://schemas.microsoft.com/office/word/2010/wordprocessingShape" mc:Ignorable="w14 w15 w16se w16cid w16 w16cex w16sdtdh w16sdtfl w16du wp14">
+  <w:abstractNum w:abstractNumId="0" w15:restartNumberingAfterBreak="0">
     <w:nsid w:val="0000A990"/>
     <w:multiLevelType w:val="multilevel"/>
+    <w:tmpl w:val="6116FCD6"/>
     <w:lvl w:ilvl="0">
       <w:numFmt w:val="bullet"/>
       <w:lvlText w:val=" "/>
@@ -741,21 +836,21 @@
       </w:pPr>
     </w:lvl>
   </w:abstractNum>
-  <w:num w:numId="1000">
-    <w:abstractNumId w:val="990"/>
+  <w:num w:numId="1" w16cid:durableId="1916469538">
+    <w:abstractNumId w:val="0"/>
   </w:num>
 </w:numbering>
 </file>
 
 <file path=word/styles.xml><?xml version="1.0" encoding="utf-8"?>
-<w:styles xmlns:r="http://schemas.openxmlformats.org/officeDocument/2006/relationships" xmlns:w="http://schemas.openxmlformats.org/wordprocessingml/2006/main">
+<w:styles xmlns:mc="http://schemas.openxmlformats.org/markup-compatibility/2006" xmlns:r="http://schemas.openxmlformats.org/officeDocument/2006/relationships" xmlns:w="http://schemas.openxmlformats.org/wordprocessingml/2006/main" xmlns:w14="http://schemas.microsoft.com/office/word/2010/wordml" xmlns:w15="http://schemas.microsoft.com/office/word/2012/wordml" xmlns:w16cex="http://schemas.microsoft.com/office/word/2018/wordml/cex" xmlns:w16cid="http://schemas.microsoft.com/office/word/2016/wordml/cid" xmlns:w16="http://schemas.microsoft.com/office/word/2018/wordml" xmlns:w16du="http://schemas.microsoft.com/office/word/2023/wordml/word16du" xmlns:w16sdtdh="http://schemas.microsoft.com/office/word/2020/wordml/sdtdatahash" xmlns:w16sdtfl="http://schemas.microsoft.com/office/word/2024/wordml/sdtformatlock" xmlns:w16se="http://schemas.microsoft.com/office/word/2015/wordml/symex" mc:Ignorable="w14 w15 w16se w16cid w16 w16cex w16sdtdh w16sdtfl w16du">
   <w:docDefaults>
     <w:rPrDefault>
       <w:rPr>
-        <w:rFonts w:asciiTheme="minorHAnsi" w:cstheme="minorBidi" w:eastAsiaTheme="minorEastAsia" w:hAnsiTheme="minorHAnsi"/>
+        <w:rFonts w:asciiTheme="minorHAnsi" w:eastAsiaTheme="minorEastAsia" w:hAnsiTheme="minorHAnsi" w:cstheme="minorBidi"/>
         <w:sz w:val="24"/>
         <w:szCs w:val="24"/>
-        <w:lang w:bidi="ar-SA" w:eastAsia="zh-CN" w:val="en-US"/>
+        <w:lang w:val="en-US" w:eastAsia="zh-CN" w:bidi="ar-SA"/>
       </w:rPr>
     </w:rPrDefault>
     <w:pPrDefault>
@@ -764,193 +859,280 @@
       </w:pPr>
     </w:pPrDefault>
   </w:docDefaults>
-  <w:latentStyles w:count="276" w:defLockedState="0" w:defQFormat="0" w:defSemiHidden="0" w:defUIPriority="0" w:defUnhideWhenUsed="0"/>
-  <w:style w:default="1" w:styleId="Normal" w:type="paragraph">
+  <w:latentStyles w:defLockedState="0" w:defUIPriority="0" w:defSemiHidden="0" w:defUnhideWhenUsed="0" w:defQFormat="0" w:count="376">
+    <w:lsdException w:name="Normal Table" w:semiHidden="1" w:unhideWhenUsed="1"/>
+    <w:lsdException w:name="Table Simple 1" w:semiHidden="1" w:unhideWhenUsed="1"/>
+    <w:lsdException w:name="Table Simple 2" w:semiHidden="1" w:unhideWhenUsed="1"/>
+    <w:lsdException w:name="Table Simple 3" w:semiHidden="1" w:unhideWhenUsed="1"/>
+    <w:lsdException w:name="Table Classic 1" w:semiHidden="1" w:unhideWhenUsed="1"/>
+    <w:lsdException w:name="Table Classic 2" w:semiHidden="1" w:unhideWhenUsed="1"/>
+    <w:lsdException w:name="Table Classic 3" w:semiHidden="1" w:unhideWhenUsed="1"/>
+    <w:lsdException w:name="Table Classic 4" w:semiHidden="1" w:unhideWhenUsed="1"/>
+    <w:lsdException w:name="Table Colorful 1" w:semiHidden="1" w:unhideWhenUsed="1"/>
+    <w:lsdException w:name="Table Colorful 2" w:semiHidden="1" w:unhideWhenUsed="1"/>
+    <w:lsdException w:name="Table Colorful 3" w:semiHidden="1" w:unhideWhenUsed="1"/>
+    <w:lsdException w:name="Table Columns 1" w:semiHidden="1" w:unhideWhenUsed="1"/>
+    <w:lsdException w:name="Table Columns 2" w:semiHidden="1" w:unhideWhenUsed="1"/>
+    <w:lsdException w:name="Table Columns 3" w:semiHidden="1" w:unhideWhenUsed="1"/>
+    <w:lsdException w:name="Table Columns 4" w:semiHidden="1" w:unhideWhenUsed="1"/>
+    <w:lsdException w:name="Table Columns 5" w:semiHidden="1" w:unhideWhenUsed="1"/>
+    <w:lsdException w:name="Table Grid 1" w:semiHidden="1" w:unhideWhenUsed="1"/>
+    <w:lsdException w:name="Table Grid 2" w:semiHidden="1" w:unhideWhenUsed="1"/>
+    <w:lsdException w:name="Table Grid 3" w:semiHidden="1" w:unhideWhenUsed="1"/>
+    <w:lsdException w:name="Table Grid 4" w:semiHidden="1" w:unhideWhenUsed="1"/>
+    <w:lsdException w:name="Table Grid 5" w:semiHidden="1" w:unhideWhenUsed="1"/>
+    <w:lsdException w:name="Table Grid 6" w:semiHidden="1" w:unhideWhenUsed="1"/>
+    <w:lsdException w:name="Table Grid 7" w:semiHidden="1" w:unhideWhenUsed="1"/>
+    <w:lsdException w:name="Table Grid 8" w:semiHidden="1" w:unhideWhenUsed="1"/>
+    <w:lsdException w:name="Table List 1" w:semiHidden="1" w:unhideWhenUsed="1"/>
+    <w:lsdException w:name="Table List 2" w:semiHidden="1" w:unhideWhenUsed="1"/>
+    <w:lsdException w:name="Table List 3" w:semiHidden="1" w:unhideWhenUsed="1"/>
+    <w:lsdException w:name="Table List 4" w:semiHidden="1" w:unhideWhenUsed="1"/>
+    <w:lsdException w:name="Table List 5" w:semiHidden="1" w:unhideWhenUsed="1"/>
+    <w:lsdException w:name="Table List 6" w:semiHidden="1" w:unhideWhenUsed="1"/>
+    <w:lsdException w:name="Table List 7" w:semiHidden="1" w:unhideWhenUsed="1"/>
+    <w:lsdException w:name="Table List 8" w:semiHidden="1" w:unhideWhenUsed="1"/>
+    <w:lsdException w:name="Table 3D effects 1" w:semiHidden="1" w:unhideWhenUsed="1"/>
+    <w:lsdException w:name="Table 3D effects 2" w:semiHidden="1" w:unhideWhenUsed="1"/>
+    <w:lsdException w:name="Table 3D effects 3" w:semiHidden="1" w:unhideWhenUsed="1"/>
+    <w:lsdException w:name="Table Contemporary" w:semiHidden="1" w:unhideWhenUsed="1"/>
+    <w:lsdException w:name="Table Elegant" w:semiHidden="1" w:unhideWhenUsed="1"/>
+    <w:lsdException w:name="Table Professional" w:semiHidden="1" w:unhideWhenUsed="1"/>
+    <w:lsdException w:name="Table Subtle 1" w:semiHidden="1" w:unhideWhenUsed="1"/>
+    <w:lsdException w:name="Table Subtle 2" w:semiHidden="1" w:unhideWhenUsed="1"/>
+    <w:lsdException w:name="Table Web 1" w:semiHidden="1" w:unhideWhenUsed="1"/>
+    <w:lsdException w:name="Table Web 2" w:semiHidden="1" w:unhideWhenUsed="1"/>
+    <w:lsdException w:name="Table Web 3" w:semiHidden="1" w:unhideWhenUsed="1"/>
+    <w:lsdException w:name="Table Theme" w:semiHidden="1" w:unhideWhenUsed="1"/>
+    <w:lsdException w:name="Light Shading"/>
+    <w:lsdException w:name="Light List"/>
+    <w:lsdException w:name="Light Grid"/>
+    <w:lsdException w:name="Medium Shading 1"/>
+    <w:lsdException w:name="Medium Shading 2"/>
+    <w:lsdException w:name="Medium List 1"/>
+    <w:lsdException w:name="Medium List 2"/>
+    <w:lsdException w:name="Medium Grid 1"/>
+    <w:lsdException w:name="Medium Grid 2"/>
+    <w:lsdException w:name="Medium Grid 3"/>
+    <w:lsdException w:name="Dark List"/>
+    <w:lsdException w:name="Colorful Shading"/>
+    <w:lsdException w:name="Colorful List"/>
+    <w:lsdException w:name="Colorful Grid"/>
+    <w:lsdException w:name="Light Shading Accent 1"/>
+    <w:lsdException w:name="Light List Accent 1"/>
+    <w:lsdException w:name="Light Grid Accent 1"/>
+    <w:lsdException w:name="Medium Shading 1 Accent 1"/>
+    <w:lsdException w:name="Medium Shading 2 Accent 1"/>
+    <w:lsdException w:name="Medium List 1 Accent 1"/>
+    <w:lsdException w:name="Medium List 2 Accent 1"/>
+    <w:lsdException w:name="Medium Grid 1 Accent 1"/>
+    <w:lsdException w:name="Medium Grid 2 Accent 1"/>
+    <w:lsdException w:name="Medium Grid 3 Accent 1"/>
+    <w:lsdException w:name="Dark List Accent 1"/>
+    <w:lsdException w:name="Colorful Shading Accent 1"/>
+    <w:lsdException w:name="Colorful List Accent 1"/>
+    <w:lsdException w:name="Colorful Grid Accent 1"/>
+    <w:lsdException w:name="Light Shading Accent 2"/>
+    <w:lsdException w:name="Light List Accent 2"/>
+    <w:lsdException w:name="Light Grid Accent 2"/>
+    <w:lsdException w:name="Medium Shading 1 Accent 2"/>
+    <w:lsdException w:name="Medium Shading 2 Accent 2"/>
+    <w:lsdException w:name="Medium List 1 Accent 2"/>
+    <w:lsdException w:name="Medium List 2 Accent 2"/>
+    <w:lsdException w:name="Medium Grid 1 Accent 2"/>
+    <w:lsdException w:name="Medium Grid 2 Accent 2"/>
+    <w:lsdException w:name="Medium Grid 3 Accent 2"/>
+    <w:lsdException w:name="Dark List Accent 2"/>
+    <w:lsdException w:name="Colorful Shading Accent 2"/>
+    <w:lsdException w:name="Colorful List Accent 2"/>
+    <w:lsdException w:name="Colorful Grid Accent 2"/>
+    <w:lsdException w:name="Light Shading Accent 3"/>
+    <w:lsdException w:name="Light List Accent 3"/>
+    <w:lsdException w:name="Light Grid Accent 3"/>
+    <w:lsdException w:name="Medium Shading 1 Accent 3"/>
+    <w:lsdException w:name="Medium Shading 2 Accent 3"/>
+    <w:lsdException w:name="Medium List 1 Accent 3"/>
+    <w:lsdException w:name="Medium List 2 Accent 3"/>
+    <w:lsdException w:name="Medium Grid 1 Accent 3"/>
+    <w:lsdException w:name="Medium Grid 2 Accent 3"/>
+    <w:lsdException w:name="Medium Grid 3 Accent 3"/>
+    <w:lsdException w:name="Dark List Accent 3"/>
+    <w:lsdException w:name="Colorful Shading Accent 3"/>
+    <w:lsdException w:name="Colorful List Accent 3"/>
+    <w:lsdException w:name="Colorful Grid Accent 3"/>
+    <w:lsdException w:name="Light Shading Accent 4"/>
+    <w:lsdException w:name="Light List Accent 4"/>
+    <w:lsdException w:name="Light Grid Accent 4"/>
+    <w:lsdException w:name="Medium Shading 1 Accent 4"/>
+    <w:lsdException w:name="Medium Shading 2 Accent 4"/>
+    <w:lsdException w:name="Medium List 1 Accent 4"/>
+    <w:lsdException w:name="Medium List 2 Accent 4"/>
+    <w:lsdException w:name="Medium Grid 1 Accent 4"/>
+    <w:lsdException w:name="Medium Grid 2 Accent 4"/>
+    <w:lsdException w:name="Medium Grid 3 Accent 4"/>
+    <w:lsdException w:name="Dark List Accent 4"/>
+    <w:lsdException w:name="Colorful Shading Accent 4"/>
+    <w:lsdException w:name="Colorful List Accent 4"/>
+    <w:lsdException w:name="Colorful Grid Accent 4"/>
+    <w:lsdException w:name="Light Shading Accent 5"/>
+    <w:lsdException w:name="Light List Accent 5"/>
+    <w:lsdException w:name="Light Grid Accent 5"/>
+    <w:lsdException w:name="Medium Shading 1 Accent 5"/>
+    <w:lsdException w:name="Medium Shading 2 Accent 5"/>
+    <w:lsdException w:name="Medium List 1 Accent 5"/>
+    <w:lsdException w:name="Medium List 2 Accent 5"/>
+    <w:lsdException w:name="Medium Grid 1 Accent 5"/>
+    <w:lsdException w:name="Medium Grid 2 Accent 5"/>
+    <w:lsdException w:name="Medium Grid 3 Accent 5"/>
+    <w:lsdException w:name="Dark List Accent 5"/>
+    <w:lsdException w:name="Colorful Shading Accent 5"/>
+    <w:lsdException w:name="Colorful List Accent 5"/>
+    <w:lsdException w:name="Colorful Grid Accent 5"/>
+    <w:lsdException w:name="Light Shading Accent 6"/>
+    <w:lsdException w:name="Light List Accent 6"/>
+    <w:lsdException w:name="Light Grid Accent 6"/>
+    <w:lsdException w:name="Medium Shading 1 Accent 6"/>
+    <w:lsdException w:name="Medium Shading 2 Accent 6"/>
+    <w:lsdException w:name="Medium List 1 Accent 6"/>
+    <w:lsdException w:name="Medium List 2 Accent 6"/>
+    <w:lsdException w:name="Medium Grid 1 Accent 6"/>
+    <w:lsdException w:name="Medium Grid 2 Accent 6"/>
+    <w:lsdException w:name="Medium Grid 3 Accent 6"/>
+    <w:lsdException w:name="Dark List Accent 6"/>
+    <w:lsdException w:name="Colorful Shading Accent 6"/>
+    <w:lsdException w:name="Colorful List Accent 6"/>
+    <w:lsdException w:name="Colorful Grid Accent 6"/>
+    <w:lsdException w:name="Grid Table 4" w:uiPriority="49"/>
+    <w:lsdException w:name="Grid Table 5 Dark" w:uiPriority="50"/>
+    <w:lsdException w:name="Grid Table 6 Colorful" w:uiPriority="51"/>
+    <w:lsdException w:name="Grid Table 7 Colorful" w:uiPriority="52"/>
+    <w:lsdException w:name="Grid Table 1 Light Accent 1" w:uiPriority="46"/>
+    <w:lsdException w:name="Grid Table 2 Accent 1" w:uiPriority="47"/>
+    <w:lsdException w:name="Grid Table 3 Accent 1" w:uiPriority="48"/>
+    <w:lsdException w:name="Grid Table 4 Accent 1" w:uiPriority="49"/>
+    <w:lsdException w:name="Grid Table 5 Dark Accent 1" w:uiPriority="50"/>
+    <w:lsdException w:name="Grid Table 6 Colorful Accent 1" w:uiPriority="51"/>
+    <w:lsdException w:name="Grid Table 7 Colorful Accent 1" w:uiPriority="52"/>
+    <w:lsdException w:name="Grid Table 1 Light Accent 2" w:uiPriority="46"/>
+    <w:lsdException w:name="Grid Table 2 Accent 2" w:uiPriority="47"/>
+    <w:lsdException w:name="Grid Table 3 Accent 2" w:uiPriority="48"/>
+    <w:lsdException w:name="Grid Table 4 Accent 2" w:uiPriority="49"/>
+    <w:lsdException w:name="Grid Table 5 Dark Accent 2" w:uiPriority="50"/>
+    <w:lsdException w:name="Grid Table 6 Colorful Accent 2" w:uiPriority="51"/>
+    <w:lsdException w:name="Grid Table 7 Colorful Accent 2" w:uiPriority="52"/>
+    <w:lsdException w:name="Grid Table 1 Light Accent 3" w:uiPriority="46"/>
+    <w:lsdException w:name="Grid Table 2 Accent 3" w:uiPriority="47"/>
+    <w:lsdException w:name="Grid Table 3 Accent 3" w:uiPriority="48"/>
+    <w:lsdException w:name="Grid Table 4 Accent 3" w:uiPriority="49"/>
+    <w:lsdException w:name="Grid Table 5 Dark Accent 3" w:uiPriority="50"/>
+    <w:lsdException w:name="Grid Table 6 Colorful Accent 3" w:uiPriority="51"/>
+    <w:lsdException w:name="Grid Table 7 Colorful Accent 3" w:uiPriority="52"/>
+    <w:lsdException w:name="Grid Table 1 Light Accent 4" w:uiPriority="46"/>
+    <w:lsdException w:name="Grid Table 2 Accent 4" w:uiPriority="47"/>
+    <w:lsdException w:name="Grid Table 3 Accent 4" w:uiPriority="48"/>
+    <w:lsdException w:name="Grid Table 4 Accent 4" w:uiPriority="49"/>
+    <w:lsdException w:name="Grid Table 5 Dark Accent 4" w:uiPriority="50"/>
+    <w:lsdException w:name="Grid Table 6 Colorful Accent 4" w:uiPriority="51"/>
+    <w:lsdException w:name="Grid Table 7 Colorful Accent 4" w:uiPriority="52"/>
+    <w:lsdException w:name="Grid Table 1 Light Accent 5" w:uiPriority="46"/>
+    <w:lsdException w:name="Grid Table 2 Accent 5" w:uiPriority="47"/>
+    <w:lsdException w:name="Grid Table 3 Accent 5" w:uiPriority="48"/>
+    <w:lsdException w:name="Grid Table 4 Accent 5" w:uiPriority="49"/>
+    <w:lsdException w:name="Grid Table 5 Dark Accent 5" w:uiPriority="50"/>
+    <w:lsdException w:name="Grid Table 6 Colorful Accent 5" w:uiPriority="51"/>
+    <w:lsdException w:name="Grid Table 7 Colorful Accent 5" w:uiPriority="52"/>
+    <w:lsdException w:name="Grid Table 1 Light Accent 6" w:uiPriority="46"/>
+    <w:lsdException w:name="Grid Table 2 Accent 6" w:uiPriority="47"/>
+    <w:lsdException w:name="Grid Table 3 Accent 6" w:uiPriority="48"/>
+    <w:lsdException w:name="Grid Table 4 Accent 6" w:uiPriority="49"/>
+    <w:lsdException w:name="Grid Table 5 Dark Accent 6" w:uiPriority="50"/>
+    <w:lsdException w:name="Grid Table 6 Colorful Accent 6" w:uiPriority="51"/>
+    <w:lsdException w:name="Grid Table 7 Colorful Accent 6" w:uiPriority="52"/>
+    <w:lsdException w:name="List Table 1 Light" w:uiPriority="46"/>
+    <w:lsdException w:name="List Table 2" w:uiPriority="47"/>
+    <w:lsdException w:name="List Table 3" w:uiPriority="48"/>
+    <w:lsdException w:name="List Table 4" w:uiPriority="49"/>
+    <w:lsdException w:name="List Table 5 Dark" w:uiPriority="50"/>
+    <w:lsdException w:name="List Table 6 Colorful" w:uiPriority="51"/>
+    <w:lsdException w:name="List Table 7 Colorful" w:uiPriority="52"/>
+    <w:lsdException w:name="List Table 1 Light Accent 1" w:uiPriority="46"/>
+    <w:lsdException w:name="List Table 2 Accent 1" w:uiPriority="47"/>
+    <w:lsdException w:name="List Table 3 Accent 1" w:uiPriority="48"/>
+    <w:lsdException w:name="List Table 4 Accent 1" w:uiPriority="49"/>
+    <w:lsdException w:name="List Table 5 Dark Accent 1" w:uiPriority="50"/>
+    <w:lsdException w:name="List Table 6 Colorful Accent 1" w:uiPriority="51"/>
+    <w:lsdException w:name="List Table 7 Colorful Accent 1" w:uiPriority="52"/>
+    <w:lsdException w:name="List Table 1 Light Accent 2" w:uiPriority="46"/>
+    <w:lsdException w:name="List Table 2 Accent 2" w:uiPriority="47"/>
+    <w:lsdException w:name="List Table 3 Accent 2" w:uiPriority="48"/>
+    <w:lsdException w:name="List Table 4 Accent 2" w:uiPriority="49"/>
+    <w:lsdException w:name="List Table 5 Dark Accent 2" w:uiPriority="50"/>
+    <w:lsdException w:name="List Table 6 Colorful Accent 2" w:uiPriority="51"/>
+    <w:lsdException w:name="List Table 7 Colorful Accent 2" w:uiPriority="52"/>
+    <w:lsdException w:name="List Table 1 Light Accent 3" w:uiPriority="46"/>
+    <w:lsdException w:name="List Table 2 Accent 3" w:uiPriority="47"/>
+    <w:lsdException w:name="List Table 3 Accent 3" w:uiPriority="48"/>
+    <w:lsdException w:name="List Table 4 Accent 3" w:uiPriority="49"/>
+    <w:lsdException w:name="List Table 5 Dark Accent 3" w:uiPriority="50"/>
+    <w:lsdException w:name="List Table 6 Colorful Accent 3" w:uiPriority="51"/>
+    <w:lsdException w:name="List Table 7 Colorful Accent 3" w:uiPriority="52"/>
+    <w:lsdException w:name="List Table 1 Light Accent 4" w:uiPriority="46"/>
+    <w:lsdException w:name="List Table 2 Accent 4" w:uiPriority="47"/>
+    <w:lsdException w:name="List Table 3 Accent 4" w:uiPriority="48"/>
+    <w:lsdException w:name="List Table 4 Accent 4" w:uiPriority="49"/>
+    <w:lsdException w:name="List Table 5 Dark Accent 4" w:uiPriority="50"/>
+    <w:lsdException w:name="List Table 6 Colorful Accent 4" w:uiPriority="51"/>
+    <w:lsdException w:name="List Table 7 Colorful Accent 4" w:uiPriority="52"/>
+    <w:lsdException w:name="List Table 1 Light Accent 5" w:uiPriority="46"/>
+    <w:lsdException w:name="List Table 2 Accent 5" w:uiPriority="47"/>
+    <w:lsdException w:name="List Table 3 Accent 5" w:uiPriority="48"/>
+    <w:lsdException w:name="List Table 4 Accent 5" w:uiPriority="49"/>
+    <w:lsdException w:name="List Table 5 Dark Accent 5" w:uiPriority="50"/>
+    <w:lsdException w:name="List Table 6 Colorful Accent 5" w:uiPriority="51"/>
+    <w:lsdException w:name="List Table 7 Colorful Accent 5" w:uiPriority="52"/>
+    <w:lsdException w:name="List Table 1 Light Accent 6" w:uiPriority="46"/>
+    <w:lsdException w:name="List Table 2 Accent 6" w:uiPriority="47"/>
+    <w:lsdException w:name="List Table 3 Accent 6" w:uiPriority="48"/>
+    <w:lsdException w:name="List Table 4 Accent 6" w:uiPriority="49"/>
+    <w:lsdException w:name="List Table 5 Dark Accent 6" w:uiPriority="50"/>
+    <w:lsdException w:name="List Table 6 Colorful Accent 6" w:uiPriority="51"/>
+    <w:lsdException w:name="List Table 7 Colorful Accent 6" w:uiPriority="52"/>
+    <w:lsdException w:name="Mention" w:semiHidden="1" w:uiPriority="99" w:unhideWhenUsed="1"/>
+    <w:lsdException w:name="Smart Hyperlink" w:semiHidden="1" w:uiPriority="99" w:unhideWhenUsed="1"/>
+    <w:lsdException w:name="Hashtag" w:semiHidden="1" w:uiPriority="99" w:unhideWhenUsed="1"/>
+    <w:lsdException w:name="Unresolved Mention" w:semiHidden="1" w:uiPriority="99" w:unhideWhenUsed="1"/>
+    <w:lsdException w:name="Smart Link" w:semiHidden="1" w:uiPriority="99" w:unhideWhenUsed="1"/>
+  </w:latentStyles>
+  <w:style w:type="paragraph" w:default="1" w:styleId="Normal">
     <w:name w:val="Normal"/>
     <w:qFormat/>
   </w:style>
-  <w:style w:styleId="BodyText" w:type="paragraph">
-    <w:name w:val="Body Text"/>
+  <w:style w:type="paragraph" w:styleId="Ttulo1">
+    <w:name w:val="heading 1"/>
     <w:basedOn w:val="Normal"/>
-    <w:link w:val="BodyTextChar"/>
-    <w:qFormat/>
-    <w:pPr>
-      <w:spacing w:after="180" w:before="180"/>
-    </w:pPr>
-  </w:style>
-  <w:style w:customStyle="1" w:styleId="FirstParagraph" w:type="paragraph">
-    <w:name w:val="First Paragraph"/>
-    <w:basedOn w:val="BodyText"/>
-    <w:next w:val="BodyText"/>
-    <w:qFormat/>
-  </w:style>
-  <w:style w:customStyle="1" w:styleId="Compact" w:type="paragraph">
-    <w:name w:val="Compact"/>
-    <w:basedOn w:val="BodyText"/>
-    <w:qFormat/>
-    <w:pPr>
-      <w:spacing w:after="36" w:before="36"/>
-    </w:pPr>
-  </w:style>
-  <w:style w:styleId="Title" w:type="paragraph">
-    <w:name w:val="Title"/>
-    <w:basedOn w:val="Normal"/>
-    <w:next w:val="BodyText"/>
-    <w:link w:val="TitleChar"/>
-    <w:uiPriority w:val="10"/>
+    <w:next w:val="Textoindependiente"/>
+    <w:link w:val="Ttulo1Car"/>
+    <w:uiPriority w:val="9"/>
     <w:qFormat/>
     <w:rsid w:val="00A10FD9"/>
-    <w:pPr>
-      <w:spacing w:after="80" w:line="240" w:lineRule="auto"/>
-      <w:contextualSpacing/>
-      <w:jc w:val="center"/>
-    </w:pPr>
-    <w:rPr>
-      <w:rFonts w:asciiTheme="majorHAnsi" w:cstheme="majorBidi" w:eastAsiaTheme="majorEastAsia" w:hAnsiTheme="majorHAnsi"/>
-      <w:sz w:val="56"/>
-      <w:szCs w:val="56"/>
-    </w:rPr>
-  </w:style>
-  <w:style w:customStyle="1" w:styleId="TitleChar" w:type="character">
-    <w:name w:val="Title Char"/>
-    <w:basedOn w:val="DefaultParagraphFont"/>
-    <w:link w:val="Title"/>
-    <w:uiPriority w:val="10"/>
-    <w:rsid w:val="00A10FD9"/>
-    <w:rPr>
-      <w:rFonts w:asciiTheme="majorHAnsi" w:cstheme="majorBidi" w:eastAsiaTheme="majorEastAsia" w:hAnsiTheme="majorHAnsi"/>
-      <w:sz w:val="56"/>
-      <w:szCs w:val="56"/>
-    </w:rPr>
-  </w:style>
-  <w:style w:styleId="Subtitle" w:type="paragraph">
-    <w:name w:val="Subtitle"/>
-    <w:basedOn w:val="Title"/>
-    <w:next w:val="BodyText"/>
-    <w:link w:val="SubtitleChar"/>
-    <w:uiPriority w:val="11"/>
-    <w:qFormat/>
-    <w:rsid w:val="00A10FD9"/>
-    <w:pPr>
-      <w:numPr>
-        <w:ilvl w:val="1"/>
-      </w:numPr>
-    </w:pPr>
-    <w:rPr>
-      <w:rFonts w:cstheme="majorBidi" w:eastAsiaTheme="majorEastAsia"/>
-      <w:spacing w:val="15"/>
-      <w:sz w:val="28"/>
-      <w:szCs w:val="28"/>
-    </w:rPr>
-  </w:style>
-  <w:style w:customStyle="1" w:styleId="SubtitleChar" w:type="character">
-    <w:name w:val="Subtitle Char"/>
-    <w:basedOn w:val="DefaultParagraphFont"/>
-    <w:link w:val="Subtitle"/>
-    <w:uiPriority w:val="11"/>
-    <w:rsid w:val="00A10FD9"/>
-    <w:rPr>
-      <w:rFonts w:cstheme="majorBidi" w:eastAsiaTheme="majorEastAsia"/>
-      <w:color w:themeColor="text1" w:themeTint="A6" w:val="595959"/>
-      <w:spacing w:val="15"/>
-      <w:sz w:val="28"/>
-      <w:szCs w:val="28"/>
-    </w:rPr>
-  </w:style>
-  <w:style w:customStyle="1" w:styleId="Author" w:type="paragraph">
-    <w:name w:val="Author"/>
-    <w:basedOn w:val="Title"/>
-    <w:next w:val="BodyText"/>
-    <w:qFormat/>
     <w:pPr>
       <w:keepNext/>
       <w:keepLines/>
-    </w:pPr>
-    <w:rPr>
-      <w:sz w:val="24"/>
-      <w:szCs w:val="24"/>
-    </w:rPr>
-  </w:style>
-  <w:style w:styleId="Date" w:type="paragraph">
-    <w:name w:val="Date"/>
-    <w:basedOn w:val="Title"/>
-    <w:next w:val="BodyText"/>
-    <w:qFormat/>
-    <w:pPr>
-      <w:keepNext/>
-      <w:keepLines/>
-    </w:pPr>
-    <w:rPr>
-      <w:sz w:val="24"/>
-      <w:szCs w:val="24"/>
-    </w:rPr>
-  </w:style>
-  <w:style w:customStyle="1" w:styleId="AbstractTitle" w:type="paragraph">
-    <w:name w:val="Abstract Title"/>
-    <w:basedOn w:val="Normal"/>
-    <w:next w:val="Abstract"/>
-    <w:qFormat/>
-    <w:pPr>
-      <w:keepNext/>
-      <w:keepLines/>
-      <w:spacing w:after="0" w:before="300"/>
-      <w:jc w:val="center"/>
-    </w:pPr>
-    <w:rPr>
-      <w:b/>
-      <w:sz w:val="20"/>
-      <w:szCs w:val="20"/>
-    </w:rPr>
-  </w:style>
-  <w:style w:customStyle="1" w:styleId="Abstract" w:type="paragraph">
-    <w:name w:val="Abstract"/>
-    <w:basedOn w:val="Normal"/>
-    <w:next w:val="BodyText"/>
-    <w:qFormat/>
-    <w:pPr>
-      <w:keepNext/>
-      <w:keepLines/>
-      <w:spacing w:after="300" w:before="100"/>
-    </w:pPr>
-    <w:rPr>
-      <w:sz w:val="20"/>
-      <w:szCs w:val="20"/>
-    </w:rPr>
-  </w:style>
-  <w:style w:styleId="Bibliography" w:type="paragraph">
-    <w:name w:val="Bibliography"/>
-    <w:basedOn w:val="Normal"/>
-    <w:next w:val="Bibliography"/>
-    <w:qFormat/>
-    <w:pPr/>
-    <w:rPr/>
-  </w:style>
-  <w:style w:styleId="Heading1" w:type="paragraph">
-    <w:name w:val="heading 1"/>
-    <w:basedOn w:val="Normal"/>
-    <w:next w:val="BodyText"/>
-    <w:link w:val="Heading1Char"/>
-    <w:uiPriority w:val="9"/>
-    <w:qFormat/>
-    <w:rsid w:val="00A10FD9"/>
-    <w:pPr>
-      <w:keepNext/>
-      <w:keepLines/>
-      <w:spacing w:after="80" w:before="360"/>
+      <w:spacing w:before="360" w:after="80"/>
       <w:outlineLvl w:val="0"/>
     </w:pPr>
     <w:rPr>
-      <w:rFonts w:asciiTheme="majorHAnsi" w:cstheme="majorBidi" w:eastAsiaTheme="majorEastAsia" w:hAnsiTheme="majorHAnsi"/>
-      <w:color w:themeColor="accent1" w:themeShade="BF" w:val="0F4761"/>
+      <w:rFonts w:asciiTheme="majorHAnsi" w:eastAsiaTheme="majorEastAsia" w:hAnsiTheme="majorHAnsi" w:cstheme="majorBidi"/>
+      <w:color w:val="0F4761" w:themeColor="accent1" w:themeShade="BF"/>
       <w:sz w:val="40"/>
       <w:szCs w:val="40"/>
     </w:rPr>
   </w:style>
-  <w:style w:styleId="Heading2" w:type="paragraph">
+  <w:style w:type="paragraph" w:styleId="Ttulo2">
     <w:name w:val="heading 2"/>
     <w:basedOn w:val="Normal"/>
-    <w:next w:val="BodyText"/>
-    <w:link w:val="Heading2Char"/>
+    <w:next w:val="Textoindependiente"/>
+    <w:link w:val="Ttulo2Car"/>
     <w:uiPriority w:val="9"/>
     <w:semiHidden/>
     <w:unhideWhenUsed/>
@@ -959,21 +1141,21 @@
     <w:pPr>
       <w:keepNext/>
       <w:keepLines/>
-      <w:spacing w:after="80" w:before="160"/>
+      <w:spacing w:before="160" w:after="80"/>
       <w:outlineLvl w:val="1"/>
     </w:pPr>
     <w:rPr>
-      <w:rFonts w:asciiTheme="majorHAnsi" w:cstheme="majorBidi" w:eastAsiaTheme="majorEastAsia" w:hAnsiTheme="majorHAnsi"/>
-      <w:color w:themeColor="accent1" w:themeShade="BF" w:val="0F4761"/>
+      <w:rFonts w:asciiTheme="majorHAnsi" w:eastAsiaTheme="majorEastAsia" w:hAnsiTheme="majorHAnsi" w:cstheme="majorBidi"/>
+      <w:color w:val="0F4761" w:themeColor="accent1" w:themeShade="BF"/>
       <w:sz w:val="32"/>
       <w:szCs w:val="32"/>
     </w:rPr>
   </w:style>
-  <w:style w:styleId="Heading3" w:type="paragraph">
+  <w:style w:type="paragraph" w:styleId="Ttulo3">
     <w:name w:val="heading 3"/>
     <w:basedOn w:val="Normal"/>
-    <w:next w:val="BodyText"/>
-    <w:link w:val="Heading3Char"/>
+    <w:next w:val="Textoindependiente"/>
+    <w:link w:val="Ttulo3Car"/>
     <w:uiPriority w:val="9"/>
     <w:semiHidden/>
     <w:unhideWhenUsed/>
@@ -982,21 +1164,21 @@
     <w:pPr>
       <w:keepNext/>
       <w:keepLines/>
-      <w:spacing w:after="80" w:before="160"/>
+      <w:spacing w:before="160" w:after="80"/>
       <w:outlineLvl w:val="2"/>
     </w:pPr>
     <w:rPr>
-      <w:rFonts w:cstheme="majorBidi" w:eastAsiaTheme="majorEastAsia"/>
-      <w:color w:themeColor="accent1" w:themeShade="BF" w:val="0F4761"/>
+      <w:rFonts w:eastAsiaTheme="majorEastAsia" w:cstheme="majorBidi"/>
+      <w:color w:val="0F4761" w:themeColor="accent1" w:themeShade="BF"/>
       <w:sz w:val="28"/>
       <w:szCs w:val="28"/>
     </w:rPr>
   </w:style>
-  <w:style w:styleId="Heading4" w:type="paragraph">
+  <w:style w:type="paragraph" w:styleId="Ttulo4">
     <w:name w:val="heading 4"/>
     <w:basedOn w:val="Normal"/>
-    <w:next w:val="BodyText"/>
-    <w:link w:val="Heading4Char"/>
+    <w:next w:val="Textoindependiente"/>
+    <w:link w:val="Ttulo4Car"/>
     <w:uiPriority w:val="9"/>
     <w:semiHidden/>
     <w:unhideWhenUsed/>
@@ -1005,21 +1187,21 @@
     <w:pPr>
       <w:keepNext/>
       <w:keepLines/>
-      <w:spacing w:after="40" w:before="80"/>
+      <w:spacing w:before="80" w:after="40"/>
       <w:outlineLvl w:val="3"/>
     </w:pPr>
     <w:rPr>
-      <w:rFonts w:cstheme="majorBidi" w:eastAsiaTheme="majorEastAsia"/>
+      <w:rFonts w:eastAsiaTheme="majorEastAsia" w:cstheme="majorBidi"/>
       <w:i/>
       <w:iCs/>
-      <w:color w:themeColor="accent1" w:themeShade="BF" w:val="0F4761"/>
-    </w:rPr>
-  </w:style>
-  <w:style w:styleId="Heading5" w:type="paragraph">
+      <w:color w:val="0F4761" w:themeColor="accent1" w:themeShade="BF"/>
+    </w:rPr>
+  </w:style>
+  <w:style w:type="paragraph" w:styleId="Ttulo5">
     <w:name w:val="heading 5"/>
     <w:basedOn w:val="Normal"/>
-    <w:next w:val="BodyText"/>
-    <w:link w:val="Heading5Char"/>
+    <w:next w:val="Textoindependiente"/>
+    <w:link w:val="Ttulo5Car"/>
     <w:uiPriority w:val="9"/>
     <w:semiHidden/>
     <w:unhideWhenUsed/>
@@ -1028,19 +1210,19 @@
     <w:pPr>
       <w:keepNext/>
       <w:keepLines/>
-      <w:spacing w:after="40" w:before="80"/>
+      <w:spacing w:before="80" w:after="40"/>
       <w:outlineLvl w:val="4"/>
     </w:pPr>
     <w:rPr>
-      <w:rFonts w:cstheme="majorBidi" w:eastAsiaTheme="majorEastAsia"/>
-      <w:color w:themeColor="accent1" w:themeShade="BF" w:val="0F4761"/>
-    </w:rPr>
-  </w:style>
-  <w:style w:styleId="Heading6" w:type="paragraph">
+      <w:rFonts w:eastAsiaTheme="majorEastAsia" w:cstheme="majorBidi"/>
+      <w:color w:val="0F4761" w:themeColor="accent1" w:themeShade="BF"/>
+    </w:rPr>
+  </w:style>
+  <w:style w:type="paragraph" w:styleId="Ttulo6">
     <w:name w:val="heading 6"/>
     <w:basedOn w:val="Normal"/>
-    <w:next w:val="BodyText"/>
-    <w:link w:val="Heading6Char"/>
+    <w:next w:val="Textoindependiente"/>
+    <w:link w:val="Ttulo6Car"/>
     <w:uiPriority w:val="9"/>
     <w:semiHidden/>
     <w:unhideWhenUsed/>
@@ -1049,21 +1231,21 @@
     <w:pPr>
       <w:keepNext/>
       <w:keepLines/>
-      <w:spacing w:after="0" w:before="40"/>
+      <w:spacing w:before="40" w:after="0"/>
       <w:outlineLvl w:val="5"/>
     </w:pPr>
     <w:rPr>
-      <w:rFonts w:cstheme="majorBidi" w:eastAsiaTheme="majorEastAsia"/>
+      <w:rFonts w:eastAsiaTheme="majorEastAsia" w:cstheme="majorBidi"/>
       <w:i/>
       <w:iCs/>
-      <w:color w:themeColor="text1" w:themeTint="A6" w:val="595959"/>
-    </w:rPr>
-  </w:style>
-  <w:style w:styleId="Heading7" w:type="paragraph">
+      <w:color w:val="595959" w:themeColor="text1" w:themeTint="A6"/>
+    </w:rPr>
+  </w:style>
+  <w:style w:type="paragraph" w:styleId="Ttulo7">
     <w:name w:val="heading 7"/>
     <w:basedOn w:val="Normal"/>
-    <w:next w:val="BodyText"/>
-    <w:link w:val="Heading7Char"/>
+    <w:next w:val="Textoindependiente"/>
+    <w:link w:val="Ttulo7Car"/>
     <w:uiPriority w:val="9"/>
     <w:semiHidden/>
     <w:unhideWhenUsed/>
@@ -1072,19 +1254,19 @@
     <w:pPr>
       <w:keepNext/>
       <w:keepLines/>
-      <w:spacing w:after="0" w:before="40"/>
+      <w:spacing w:before="40" w:after="0"/>
       <w:outlineLvl w:val="6"/>
     </w:pPr>
     <w:rPr>
-      <w:rFonts w:cstheme="majorBidi" w:eastAsiaTheme="majorEastAsia"/>
-      <w:color w:themeColor="text1" w:themeTint="A6" w:val="595959"/>
-    </w:rPr>
-  </w:style>
-  <w:style w:styleId="Heading8" w:type="paragraph">
+      <w:rFonts w:eastAsiaTheme="majorEastAsia" w:cstheme="majorBidi"/>
+      <w:color w:val="595959" w:themeColor="text1" w:themeTint="A6"/>
+    </w:rPr>
+  </w:style>
+  <w:style w:type="paragraph" w:styleId="Ttulo8">
     <w:name w:val="heading 8"/>
     <w:basedOn w:val="Normal"/>
-    <w:next w:val="BodyText"/>
-    <w:link w:val="Heading8Char"/>
+    <w:next w:val="Textoindependiente"/>
+    <w:link w:val="Ttulo8Car"/>
     <w:uiPriority w:val="9"/>
     <w:semiHidden/>
     <w:unhideWhenUsed/>
@@ -1097,17 +1279,17 @@
       <w:outlineLvl w:val="7"/>
     </w:pPr>
     <w:rPr>
-      <w:rFonts w:cstheme="majorBidi" w:eastAsiaTheme="majorEastAsia"/>
+      <w:rFonts w:eastAsiaTheme="majorEastAsia" w:cstheme="majorBidi"/>
       <w:i/>
       <w:iCs/>
-      <w:color w:themeColor="text1" w:themeTint="D8" w:val="272727"/>
-    </w:rPr>
-  </w:style>
-  <w:style w:styleId="Heading9" w:type="paragraph">
+      <w:color w:val="272727" w:themeColor="text1" w:themeTint="D8"/>
+    </w:rPr>
+  </w:style>
+  <w:style w:type="paragraph" w:styleId="Ttulo9">
     <w:name w:val="heading 9"/>
     <w:basedOn w:val="Normal"/>
-    <w:next w:val="BodyText"/>
-    <w:link w:val="Heading9Char"/>
+    <w:next w:val="Textoindependiente"/>
+    <w:link w:val="Ttulo9Car"/>
     <w:uiPriority w:val="9"/>
     <w:semiHidden/>
     <w:unhideWhenUsed/>
@@ -1120,191 +1302,363 @@
       <w:outlineLvl w:val="8"/>
     </w:pPr>
     <w:rPr>
-      <w:rFonts w:cstheme="majorBidi" w:eastAsiaTheme="majorEastAsia"/>
-      <w:color w:themeColor="text1" w:themeTint="D8" w:val="272727"/>
-    </w:rPr>
-  </w:style>
-  <w:style w:customStyle="1" w:styleId="Heading1Char" w:type="character">
-    <w:name w:val="Heading 1 Char"/>
-    <w:basedOn w:val="DefaultParagraphFont"/>
-    <w:link w:val="Heading1"/>
+      <w:rFonts w:eastAsiaTheme="majorEastAsia" w:cstheme="majorBidi"/>
+      <w:color w:val="272727" w:themeColor="text1" w:themeTint="D8"/>
+    </w:rPr>
+  </w:style>
+  <w:style w:type="character" w:default="1" w:styleId="Fuentedeprrafopredeter">
+    <w:name w:val="Default Paragraph Font"/>
+    <w:uiPriority w:val="1"/>
+    <w:semiHidden/>
+    <w:unhideWhenUsed/>
+  </w:style>
+  <w:style w:type="table" w:default="1" w:styleId="Tablanormal">
+    <w:name w:val="Normal Table"/>
+    <w:uiPriority w:val="99"/>
+    <w:semiHidden/>
+    <w:unhideWhenUsed/>
+    <w:tblPr>
+      <w:tblInd w:w="0" w:type="dxa"/>
+      <w:tblCellMar>
+        <w:top w:w="0" w:type="dxa"/>
+        <w:left w:w="108" w:type="dxa"/>
+        <w:bottom w:w="0" w:type="dxa"/>
+        <w:right w:w="108" w:type="dxa"/>
+      </w:tblCellMar>
+    </w:tblPr>
+  </w:style>
+  <w:style w:type="numbering" w:default="1" w:styleId="Sinlista">
+    <w:name w:val="No List"/>
+    <w:uiPriority w:val="99"/>
+    <w:semiHidden/>
+    <w:unhideWhenUsed/>
+  </w:style>
+  <w:style w:type="paragraph" w:styleId="Textoindependiente">
+    <w:name w:val="Body Text"/>
+    <w:basedOn w:val="Normal"/>
+    <w:qFormat/>
+    <w:pPr>
+      <w:spacing w:before="180" w:after="180"/>
+    </w:pPr>
+  </w:style>
+  <w:style w:type="paragraph" w:customStyle="1" w:styleId="FirstParagraph">
+    <w:name w:val="First Paragraph"/>
+    <w:basedOn w:val="Textoindependiente"/>
+    <w:next w:val="Textoindependiente"/>
+    <w:qFormat/>
+  </w:style>
+  <w:style w:type="paragraph" w:customStyle="1" w:styleId="Compact">
+    <w:name w:val="Compact"/>
+    <w:basedOn w:val="Textoindependiente"/>
+    <w:qFormat/>
+    <w:pPr>
+      <w:spacing w:before="36" w:after="36"/>
+    </w:pPr>
+  </w:style>
+  <w:style w:type="paragraph" w:styleId="Ttulo">
+    <w:name w:val="Title"/>
+    <w:basedOn w:val="Normal"/>
+    <w:next w:val="Textoindependiente"/>
+    <w:link w:val="TtuloCar"/>
+    <w:uiPriority w:val="10"/>
+    <w:qFormat/>
+    <w:rsid w:val="00A10FD9"/>
+    <w:pPr>
+      <w:spacing w:after="80"/>
+      <w:contextualSpacing/>
+      <w:jc w:val="center"/>
+    </w:pPr>
+    <w:rPr>
+      <w:rFonts w:asciiTheme="majorHAnsi" w:eastAsiaTheme="majorEastAsia" w:hAnsiTheme="majorHAnsi" w:cstheme="majorBidi"/>
+      <w:sz w:val="56"/>
+      <w:szCs w:val="56"/>
+    </w:rPr>
+  </w:style>
+  <w:style w:type="character" w:customStyle="1" w:styleId="TtuloCar">
+    <w:name w:val="Título Car"/>
+    <w:basedOn w:val="Fuentedeprrafopredeter"/>
+    <w:link w:val="Ttulo"/>
+    <w:uiPriority w:val="10"/>
+    <w:rsid w:val="00A10FD9"/>
+    <w:rPr>
+      <w:rFonts w:asciiTheme="majorHAnsi" w:eastAsiaTheme="majorEastAsia" w:hAnsiTheme="majorHAnsi" w:cstheme="majorBidi"/>
+      <w:sz w:val="56"/>
+      <w:szCs w:val="56"/>
+    </w:rPr>
+  </w:style>
+  <w:style w:type="paragraph" w:styleId="Subttulo">
+    <w:name w:val="Subtitle"/>
+    <w:basedOn w:val="Ttulo"/>
+    <w:next w:val="Textoindependiente"/>
+    <w:link w:val="SubttuloCar"/>
+    <w:uiPriority w:val="11"/>
+    <w:qFormat/>
+    <w:rsid w:val="00A10FD9"/>
+    <w:pPr>
+      <w:numPr>
+        <w:ilvl w:val="1"/>
+      </w:numPr>
+    </w:pPr>
+    <w:rPr>
+      <w:spacing w:val="15"/>
+      <w:sz w:val="28"/>
+      <w:szCs w:val="28"/>
+    </w:rPr>
+  </w:style>
+  <w:style w:type="character" w:customStyle="1" w:styleId="SubttuloCar">
+    <w:name w:val="Subtítulo Car"/>
+    <w:basedOn w:val="Fuentedeprrafopredeter"/>
+    <w:link w:val="Subttulo"/>
+    <w:uiPriority w:val="11"/>
+    <w:rsid w:val="00A10FD9"/>
+    <w:rPr>
+      <w:rFonts w:eastAsiaTheme="majorEastAsia" w:cstheme="majorBidi"/>
+      <w:color w:val="595959" w:themeColor="text1" w:themeTint="A6"/>
+      <w:spacing w:val="15"/>
+      <w:sz w:val="28"/>
+      <w:szCs w:val="28"/>
+    </w:rPr>
+  </w:style>
+  <w:style w:type="paragraph" w:customStyle="1" w:styleId="Author">
+    <w:name w:val="Author"/>
+    <w:basedOn w:val="Ttulo"/>
+    <w:next w:val="Textoindependiente"/>
+    <w:qFormat/>
+    <w:pPr>
+      <w:keepNext/>
+      <w:keepLines/>
+    </w:pPr>
+    <w:rPr>
+      <w:sz w:val="24"/>
+      <w:szCs w:val="24"/>
+    </w:rPr>
+  </w:style>
+  <w:style w:type="paragraph" w:styleId="Fecha">
+    <w:name w:val="Date"/>
+    <w:basedOn w:val="Ttulo"/>
+    <w:next w:val="Textoindependiente"/>
+    <w:qFormat/>
+    <w:pPr>
+      <w:keepNext/>
+      <w:keepLines/>
+    </w:pPr>
+    <w:rPr>
+      <w:sz w:val="24"/>
+      <w:szCs w:val="24"/>
+    </w:rPr>
+  </w:style>
+  <w:style w:type="paragraph" w:customStyle="1" w:styleId="AbstractTitle">
+    <w:name w:val="Abstract Title"/>
+    <w:basedOn w:val="Normal"/>
+    <w:next w:val="Abstract"/>
+    <w:qFormat/>
+    <w:pPr>
+      <w:keepNext/>
+      <w:keepLines/>
+      <w:spacing w:before="300" w:after="0"/>
+      <w:jc w:val="center"/>
+    </w:pPr>
+    <w:rPr>
+      <w:b/>
+      <w:sz w:val="20"/>
+      <w:szCs w:val="20"/>
+    </w:rPr>
+  </w:style>
+  <w:style w:type="paragraph" w:customStyle="1" w:styleId="Abstract">
+    <w:name w:val="Abstract"/>
+    <w:basedOn w:val="Normal"/>
+    <w:next w:val="Textoindependiente"/>
+    <w:qFormat/>
+    <w:pPr>
+      <w:keepNext/>
+      <w:keepLines/>
+      <w:spacing w:before="100" w:after="300"/>
+    </w:pPr>
+    <w:rPr>
+      <w:sz w:val="20"/>
+      <w:szCs w:val="20"/>
+    </w:rPr>
+  </w:style>
+  <w:style w:type="paragraph" w:styleId="Bibliografa">
+    <w:name w:val="Bibliography"/>
+    <w:basedOn w:val="Normal"/>
+    <w:qFormat/>
+  </w:style>
+  <w:style w:type="character" w:customStyle="1" w:styleId="Ttulo1Car">
+    <w:name w:val="Título 1 Car"/>
+    <w:basedOn w:val="Fuentedeprrafopredeter"/>
+    <w:link w:val="Ttulo1"/>
     <w:uiPriority w:val="9"/>
     <w:rsid w:val="00A10FD9"/>
     <w:rPr>
-      <w:rFonts w:asciiTheme="majorHAnsi" w:cstheme="majorBidi" w:eastAsiaTheme="majorEastAsia" w:hAnsiTheme="majorHAnsi"/>
-      <w:color w:themeColor="accent1" w:themeShade="BF" w:val="0F4761"/>
+      <w:rFonts w:asciiTheme="majorHAnsi" w:eastAsiaTheme="majorEastAsia" w:hAnsiTheme="majorHAnsi" w:cstheme="majorBidi"/>
+      <w:color w:val="0F4761" w:themeColor="accent1" w:themeShade="BF"/>
       <w:sz w:val="40"/>
       <w:szCs w:val="40"/>
     </w:rPr>
   </w:style>
-  <w:style w:customStyle="1" w:styleId="Heading2Char" w:type="character">
-    <w:name w:val="Heading 2 Char"/>
-    <w:basedOn w:val="DefaultParagraphFont"/>
-    <w:link w:val="Heading2"/>
+  <w:style w:type="character" w:customStyle="1" w:styleId="Ttulo2Car">
+    <w:name w:val="Título 2 Car"/>
+    <w:basedOn w:val="Fuentedeprrafopredeter"/>
+    <w:link w:val="Ttulo2"/>
     <w:uiPriority w:val="9"/>
     <w:semiHidden/>
     <w:rsid w:val="00A10FD9"/>
     <w:rPr>
-      <w:rFonts w:asciiTheme="majorHAnsi" w:cstheme="majorBidi" w:eastAsiaTheme="majorEastAsia" w:hAnsiTheme="majorHAnsi"/>
-      <w:color w:themeColor="accent1" w:themeShade="BF" w:val="0F4761"/>
+      <w:rFonts w:asciiTheme="majorHAnsi" w:eastAsiaTheme="majorEastAsia" w:hAnsiTheme="majorHAnsi" w:cstheme="majorBidi"/>
+      <w:color w:val="0F4761" w:themeColor="accent1" w:themeShade="BF"/>
       <w:sz w:val="32"/>
       <w:szCs w:val="32"/>
     </w:rPr>
   </w:style>
-  <w:style w:customStyle="1" w:styleId="Heading3Char" w:type="character">
-    <w:name w:val="Heading 3 Char"/>
-    <w:basedOn w:val="DefaultParagraphFont"/>
-    <w:link w:val="Heading3"/>
+  <w:style w:type="character" w:customStyle="1" w:styleId="Ttulo3Car">
+    <w:name w:val="Título 3 Car"/>
+    <w:basedOn w:val="Fuentedeprrafopredeter"/>
+    <w:link w:val="Ttulo3"/>
     <w:uiPriority w:val="9"/>
     <w:semiHidden/>
     <w:rsid w:val="00A10FD9"/>
     <w:rPr>
-      <w:rFonts w:cstheme="majorBidi" w:eastAsiaTheme="majorEastAsia"/>
-      <w:color w:themeColor="accent1" w:themeShade="BF" w:val="0F4761"/>
+      <w:rFonts w:eastAsiaTheme="majorEastAsia" w:cstheme="majorBidi"/>
+      <w:color w:val="0F4761" w:themeColor="accent1" w:themeShade="BF"/>
       <w:sz w:val="28"/>
       <w:szCs w:val="28"/>
     </w:rPr>
   </w:style>
-  <w:style w:customStyle="1" w:styleId="Heading4Char" w:type="character">
-    <w:name w:val="Heading 4 Char"/>
-    <w:basedOn w:val="DefaultParagraphFont"/>
-    <w:link w:val="Heading4"/>
+  <w:style w:type="character" w:customStyle="1" w:styleId="Ttulo4Car">
+    <w:name w:val="Título 4 Car"/>
+    <w:basedOn w:val="Fuentedeprrafopredeter"/>
+    <w:link w:val="Ttulo4"/>
     <w:uiPriority w:val="9"/>
     <w:semiHidden/>
     <w:rsid w:val="00A10FD9"/>
     <w:rPr>
-      <w:rFonts w:cstheme="majorBidi" w:eastAsiaTheme="majorEastAsia"/>
+      <w:rFonts w:eastAsiaTheme="majorEastAsia" w:cstheme="majorBidi"/>
       <w:i/>
       <w:iCs/>
-      <w:color w:themeColor="accent1" w:themeShade="BF" w:val="0F4761"/>
-    </w:rPr>
-  </w:style>
-  <w:style w:customStyle="1" w:styleId="Heading5Char" w:type="character">
-    <w:name w:val="Heading 5 Char"/>
-    <w:basedOn w:val="DefaultParagraphFont"/>
-    <w:link w:val="Heading5"/>
+      <w:color w:val="0F4761" w:themeColor="accent1" w:themeShade="BF"/>
+    </w:rPr>
+  </w:style>
+  <w:style w:type="character" w:customStyle="1" w:styleId="Ttulo5Car">
+    <w:name w:val="Título 5 Car"/>
+    <w:basedOn w:val="Fuentedeprrafopredeter"/>
+    <w:link w:val="Ttulo5"/>
     <w:uiPriority w:val="9"/>
     <w:semiHidden/>
     <w:rsid w:val="00A10FD9"/>
     <w:rPr>
-      <w:rFonts w:cstheme="majorBidi" w:eastAsiaTheme="majorEastAsia"/>
-      <w:color w:themeColor="accent1" w:themeShade="BF" w:val="0F4761"/>
-    </w:rPr>
-  </w:style>
-  <w:style w:customStyle="1" w:styleId="Heading6Char" w:type="character">
-    <w:name w:val="Heading 6 Char"/>
-    <w:basedOn w:val="DefaultParagraphFont"/>
-    <w:link w:val="Heading6"/>
+      <w:rFonts w:eastAsiaTheme="majorEastAsia" w:cstheme="majorBidi"/>
+      <w:color w:val="0F4761" w:themeColor="accent1" w:themeShade="BF"/>
+    </w:rPr>
+  </w:style>
+  <w:style w:type="character" w:customStyle="1" w:styleId="Ttulo6Car">
+    <w:name w:val="Título 6 Car"/>
+    <w:basedOn w:val="Fuentedeprrafopredeter"/>
+    <w:link w:val="Ttulo6"/>
     <w:uiPriority w:val="9"/>
     <w:semiHidden/>
     <w:rsid w:val="00A10FD9"/>
     <w:rPr>
-      <w:rFonts w:cstheme="majorBidi" w:eastAsiaTheme="majorEastAsia"/>
+      <w:rFonts w:eastAsiaTheme="majorEastAsia" w:cstheme="majorBidi"/>
       <w:i/>
       <w:iCs/>
-      <w:color w:themeColor="text1" w:themeTint="A6" w:val="595959"/>
-    </w:rPr>
-  </w:style>
-  <w:style w:customStyle="1" w:styleId="Heading7Char" w:type="character">
-    <w:name w:val="Heading 7 Char"/>
-    <w:basedOn w:val="DefaultParagraphFont"/>
-    <w:link w:val="Heading7"/>
+      <w:color w:val="595959" w:themeColor="text1" w:themeTint="A6"/>
+    </w:rPr>
+  </w:style>
+  <w:style w:type="character" w:customStyle="1" w:styleId="Ttulo7Car">
+    <w:name w:val="Título 7 Car"/>
+    <w:basedOn w:val="Fuentedeprrafopredeter"/>
+    <w:link w:val="Ttulo7"/>
     <w:uiPriority w:val="9"/>
     <w:semiHidden/>
     <w:rsid w:val="00A10FD9"/>
     <w:rPr>
-      <w:rFonts w:cstheme="majorBidi" w:eastAsiaTheme="majorEastAsia"/>
-      <w:color w:themeColor="text1" w:themeTint="A6" w:val="595959"/>
-    </w:rPr>
-  </w:style>
-  <w:style w:customStyle="1" w:styleId="Heading8Char" w:type="character">
-    <w:name w:val="Heading 8 Char"/>
-    <w:basedOn w:val="DefaultParagraphFont"/>
-    <w:link w:val="Heading8"/>
+      <w:rFonts w:eastAsiaTheme="majorEastAsia" w:cstheme="majorBidi"/>
+      <w:color w:val="595959" w:themeColor="text1" w:themeTint="A6"/>
+    </w:rPr>
+  </w:style>
+  <w:style w:type="character" w:customStyle="1" w:styleId="Ttulo8Car">
+    <w:name w:val="Título 8 Car"/>
+    <w:basedOn w:val="Fuentedeprrafopredeter"/>
+    <w:link w:val="Ttulo8"/>
     <w:uiPriority w:val="9"/>
     <w:semiHidden/>
     <w:rsid w:val="00A10FD9"/>
     <w:rPr>
-      <w:rFonts w:cstheme="majorBidi" w:eastAsiaTheme="majorEastAsia"/>
+      <w:rFonts w:eastAsiaTheme="majorEastAsia" w:cstheme="majorBidi"/>
       <w:i/>
       <w:iCs/>
-      <w:color w:themeColor="text1" w:themeTint="D8" w:val="272727"/>
-    </w:rPr>
-  </w:style>
-  <w:style w:customStyle="1" w:styleId="Heading9Char" w:type="character">
-    <w:name w:val="Heading 9 Char"/>
-    <w:basedOn w:val="DefaultParagraphFont"/>
-    <w:link w:val="Heading9"/>
+      <w:color w:val="272727" w:themeColor="text1" w:themeTint="D8"/>
+    </w:rPr>
+  </w:style>
+  <w:style w:type="character" w:customStyle="1" w:styleId="Ttulo9Car">
+    <w:name w:val="Título 9 Car"/>
+    <w:basedOn w:val="Fuentedeprrafopredeter"/>
+    <w:link w:val="Ttulo9"/>
     <w:uiPriority w:val="9"/>
     <w:semiHidden/>
     <w:rsid w:val="00A10FD9"/>
     <w:rPr>
-      <w:rFonts w:cstheme="majorBidi" w:eastAsiaTheme="majorEastAsia"/>
-      <w:color w:themeColor="text1" w:themeTint="D8" w:val="272727"/>
-    </w:rPr>
-  </w:style>
-  <w:style w:styleId="BlockText" w:type="paragraph">
+      <w:rFonts w:eastAsiaTheme="majorEastAsia" w:cstheme="majorBidi"/>
+      <w:color w:val="272727" w:themeColor="text1" w:themeTint="D8"/>
+    </w:rPr>
+  </w:style>
+  <w:style w:type="paragraph" w:styleId="Textodebloque">
     <w:name w:val="Block Text"/>
-    <w:basedOn w:val="BodyText"/>
-    <w:next w:val="BodyText"/>
+    <w:basedOn w:val="Textoindependiente"/>
+    <w:next w:val="Textoindependiente"/>
     <w:uiPriority w:val="9"/>
     <w:unhideWhenUsed/>
     <w:qFormat/>
     <w:pPr>
-      <w:spacing w:after="100" w:before="100"/>
-      <w:ind w:firstLine="0" w:left="480" w:right="480"/>
-    </w:pPr>
-  </w:style>
-  <w:style w:styleId="FootnoteText" w:type="paragraph">
-    <w:name w:val="Footnote Text"/>
+      <w:spacing w:before="100" w:after="100"/>
+      <w:ind w:left="480" w:right="480"/>
+    </w:pPr>
+  </w:style>
+  <w:style w:type="paragraph" w:styleId="Textonotapie">
+    <w:name w:val="footnote text"/>
     <w:basedOn w:val="Normal"/>
-    <w:next w:val="FootnoteText"/>
     <w:uiPriority w:val="9"/>
     <w:unhideWhenUsed/>
     <w:qFormat/>
   </w:style>
-  <w:style w:styleId="FootnoteBlockText" w:type="paragraph">
+  <w:style w:type="paragraph" w:customStyle="1" w:styleId="FootnoteBlockText">
     <w:name w:val="Footnote Block Text"/>
-    <w:basedOn w:val="FootnoteText"/>
-    <w:next w:val="FootnoteText"/>
+    <w:basedOn w:val="Textonotapie"/>
+    <w:next w:val="Textonotapie"/>
     <w:uiPriority w:val="9"/>
     <w:unhideWhenUsed/>
     <w:qFormat/>
     <w:pPr>
-      <w:spacing w:after="100" w:before="100"/>
-      <w:ind w:firstLine="0" w:left="480" w:right="480"/>
-    </w:pPr>
-  </w:style>
-  <w:style w:default="1" w:styleId="DefaultParagraphFont" w:type="character">
-    <w:name w:val="Default Paragraph Font"/>
+      <w:spacing w:before="100" w:after="100"/>
+      <w:ind w:left="480" w:right="480"/>
+    </w:pPr>
+  </w:style>
+  <w:style w:type="table" w:customStyle="1" w:styleId="Table">
+    <w:name w:val="Table"/>
     <w:semiHidden/>
     <w:unhideWhenUsed/>
-  </w:style>
-  <w:style w:default="1" w:styleId="Table" w:type="table">
-    <w:name w:val="Table"/>
-    <w:basedOn w:val="TableNormal"/>
-    <w:semiHidden/>
-    <w:unhideWhenUsed/>
     <w:qFormat/>
     <w:tblPr>
-      <w:tblInd w:type="dxa" w:w="0"/>
+      <w:tblInd w:w="0" w:type="dxa"/>
       <w:tblCellMar>
-        <w:top w:type="dxa" w:w="0"/>
-        <w:left w:type="dxa" w:w="108"/>
-        <w:bottom w:type="dxa" w:w="0"/>
-        <w:right w:type="dxa" w:w="108"/>
+        <w:top w:w="0" w:type="dxa"/>
+        <w:left w:w="108" w:type="dxa"/>
+        <w:bottom w:w="0" w:type="dxa"/>
+        <w:right w:w="108" w:type="dxa"/>
       </w:tblCellMar>
     </w:tblPr>
     <w:tblStylePr w:type="firstRow">
+      <w:tblPr/>
       <w:tcPr>
         <w:tcBorders>
-          <w:bottom w:val="single"/>
+          <w:bottom w:val="single" w:sz="0" w:space="0" w:color="auto"/>
         </w:tcBorders>
         <w:vAlign w:val="bottom"/>
       </w:tcPr>
     </w:tblStylePr>
   </w:style>
-  <w:style w:customStyle="1" w:styleId="DefinitionTerm" w:type="paragraph">
+  <w:style w:type="paragraph" w:customStyle="1" w:styleId="DefinitionTerm">
     <w:name w:val="Definition Term"/>
     <w:basedOn w:val="Normal"/>
     <w:next w:val="Definition"/>
@@ -1317,78 +1671,79 @@
       <w:b/>
     </w:rPr>
   </w:style>
-  <w:style w:customStyle="1" w:styleId="Definition" w:type="paragraph">
+  <w:style w:type="paragraph" w:customStyle="1" w:styleId="Definition">
     <w:name w:val="Definition"/>
     <w:basedOn w:val="Normal"/>
   </w:style>
-  <w:style w:styleId="Caption" w:type="paragraph">
-    <w:name w:val="Caption"/>
+  <w:style w:type="paragraph" w:styleId="Descripcin">
+    <w:name w:val="caption"/>
     <w:basedOn w:val="Normal"/>
-    <w:link w:val="BodyTextChar"/>
-    <w:pPr>
-      <w:spacing w:after="120" w:before="0"/>
+    <w:link w:val="DescripcinCar"/>
+    <w:pPr>
+      <w:spacing w:after="120"/>
     </w:pPr>
     <w:rPr>
       <w:i/>
     </w:rPr>
   </w:style>
-  <w:style w:customStyle="1" w:styleId="TableCaption" w:type="paragraph">
+  <w:style w:type="paragraph" w:customStyle="1" w:styleId="TableCaption">
     <w:name w:val="Table Caption"/>
-    <w:basedOn w:val="Caption"/>
+    <w:basedOn w:val="Descripcin"/>
     <w:pPr>
       <w:keepNext/>
     </w:pPr>
   </w:style>
-  <w:style w:customStyle="1" w:styleId="ImageCaption" w:type="paragraph">
+  <w:style w:type="paragraph" w:customStyle="1" w:styleId="ImageCaption">
     <w:name w:val="Image Caption"/>
-    <w:basedOn w:val="Caption"/>
-  </w:style>
-  <w:style w:customStyle="1" w:styleId="Figure" w:type="paragraph">
+    <w:basedOn w:val="Descripcin"/>
+  </w:style>
+  <w:style w:type="paragraph" w:customStyle="1" w:styleId="Figure">
     <w:name w:val="Figure"/>
     <w:basedOn w:val="Normal"/>
   </w:style>
-  <w:style w:customStyle="1" w:styleId="CaptionedFigure" w:type="paragraph">
+  <w:style w:type="paragraph" w:customStyle="1" w:styleId="CaptionedFigure">
     <w:name w:val="Captioned Figure"/>
     <w:basedOn w:val="Figure"/>
     <w:pPr>
       <w:keepNext/>
     </w:pPr>
   </w:style>
-  <w:style w:customStyle="1" w:styleId="BodyTextChar" w:type="character">
-    <w:name w:val="Body Text Char"/>
-    <w:basedOn w:val="DefaultParagraphFont"/>
-    <w:link w:val="BodyText"/>
-  </w:style>
-  <w:style w:customStyle="1" w:styleId="VerbatimChar" w:type="character">
+  <w:style w:type="character" w:customStyle="1" w:styleId="DescripcinCar">
+    <w:name w:val="Descripción Car"/>
+    <w:basedOn w:val="Fuentedeprrafopredeter"/>
+    <w:link w:val="Descripcin"/>
+  </w:style>
+  <w:style w:type="character" w:customStyle="1" w:styleId="VerbatimChar">
     <w:name w:val="Verbatim Char"/>
-    <w:basedOn w:val="BodyTextChar"/>
-    <w:rPr>
-      <w:rFonts w:ascii="Consolas" w:hAnsi="Consolas"/>
-      <w:sz w:val="22"/>
-    </w:rPr>
-  </w:style>
-  <w:style w:customStyle="1" w:styleId="SectionNumber" w:type="character">
+    <w:basedOn w:val="DescripcinCar"/>
+    <w:link w:val="SourceCode"/>
+    <w:rPr>
+      <w:rFonts w:ascii="Consolas" w:hAnsi="Consolas"/>
+      <w:sz w:val="22"/>
+    </w:rPr>
+  </w:style>
+  <w:style w:type="character" w:customStyle="1" w:styleId="SectionNumber">
     <w:name w:val="Section Number"/>
-    <w:basedOn w:val="BodyTextChar"/>
-  </w:style>
-  <w:style w:styleId="FootnoteReference" w:type="character">
-    <w:name w:val="Footnote Reference"/>
-    <w:basedOn w:val="BodyTextChar"/>
+    <w:basedOn w:val="DescripcinCar"/>
+  </w:style>
+  <w:style w:type="character" w:styleId="Refdenotaalpie">
+    <w:name w:val="footnote reference"/>
+    <w:basedOn w:val="DescripcinCar"/>
     <w:rPr>
       <w:vertAlign w:val="superscript"/>
     </w:rPr>
   </w:style>
-  <w:style w:styleId="Hyperlink" w:type="character">
+  <w:style w:type="character" w:styleId="Hipervnculo">
     <w:name w:val="Hyperlink"/>
-    <w:basedOn w:val="BodyTextChar"/>
-    <w:rPr>
-      <w:color w:themeColor="accent1" w:val="4F81BD"/>
-    </w:rPr>
-  </w:style>
-  <w:style w:styleId="TOCHeading" w:type="paragraph">
+    <w:basedOn w:val="DescripcinCar"/>
+    <w:rPr>
+      <w:color w:val="156082" w:themeColor="accent1"/>
+    </w:rPr>
+  </w:style>
+  <w:style w:type="paragraph" w:styleId="TtuloTDC">
     <w:name w:val="TOC Heading"/>
-    <w:basedOn w:val="Heading1"/>
-    <w:next w:val="BodyText"/>
+    <w:basedOn w:val="Ttulo1"/>
+    <w:next w:val="Textoindependiente"/>
     <w:uiPriority w:val="39"/>
     <w:unhideWhenUsed/>
     <w:qFormat/>
@@ -1396,246 +1751,305 @@
       <w:spacing w:before="240" w:line="259" w:lineRule="auto"/>
       <w:outlineLvl w:val="9"/>
     </w:pPr>
-    <w:rPr>
-      <w:rFonts w:asciiTheme="majorHAnsi" w:cstheme="majorBidi" w:eastAsiaTheme="majorEastAsia" w:hAnsiTheme="majorHAnsi"/>
-      <w:b w:val="0"/>
-      <w:bCs w:val="0"/>
-      <w:color w:themeColor="accent1" w:themeShade="BF" w:val="365F91"/>
-    </w:rPr>
   </w:style>
   <w:style w:type="paragraph" w:customStyle="1" w:styleId="SourceCode">
     <w:name w:val="Source Code"/>
     <w:basedOn w:val="Normal"/>
     <w:link w:val="VerbatimChar"/>
     <w:pPr>
-      <w:wordWrap w:val="off"/>
+      <w:wordWrap w:val="0"/>
     </w:pPr>
   </w:style>
   <w:style w:type="character" w:customStyle="1" w:styleId="KeywordTok">
     <w:name w:val="KeywordTok"/>
     <w:basedOn w:val="VerbatimChar"/>
     <w:rPr>
+      <w:rFonts w:ascii="Consolas" w:hAnsi="Consolas"/>
       <w:b/>
       <w:color w:val="007020"/>
+      <w:sz w:val="22"/>
     </w:rPr>
   </w:style>
   <w:style w:type="character" w:customStyle="1" w:styleId="DataTypeTok">
     <w:name w:val="DataTypeTok"/>
     <w:basedOn w:val="VerbatimChar"/>
     <w:rPr>
+      <w:rFonts w:ascii="Consolas" w:hAnsi="Consolas"/>
       <w:color w:val="902000"/>
+      <w:sz w:val="22"/>
     </w:rPr>
   </w:style>
   <w:style w:type="character" w:customStyle="1" w:styleId="DecValTok">
     <w:name w:val="DecValTok"/>
     <w:basedOn w:val="VerbatimChar"/>
     <w:rPr>
-      <w:color w:val="40a070"/>
+      <w:rFonts w:ascii="Consolas" w:hAnsi="Consolas"/>
+      <w:color w:val="40A070"/>
+      <w:sz w:val="22"/>
     </w:rPr>
   </w:style>
   <w:style w:type="character" w:customStyle="1" w:styleId="BaseNTok">
     <w:name w:val="BaseNTok"/>
     <w:basedOn w:val="VerbatimChar"/>
     <w:rPr>
-      <w:color w:val="40a070"/>
+      <w:rFonts w:ascii="Consolas" w:hAnsi="Consolas"/>
+      <w:color w:val="40A070"/>
+      <w:sz w:val="22"/>
     </w:rPr>
   </w:style>
   <w:style w:type="character" w:customStyle="1" w:styleId="FloatTok">
     <w:name w:val="FloatTok"/>
     <w:basedOn w:val="VerbatimChar"/>
     <w:rPr>
-      <w:color w:val="40a070"/>
+      <w:rFonts w:ascii="Consolas" w:hAnsi="Consolas"/>
+      <w:color w:val="40A070"/>
+      <w:sz w:val="22"/>
     </w:rPr>
   </w:style>
   <w:style w:type="character" w:customStyle="1" w:styleId="ConstantTok">
     <w:name w:val="ConstantTok"/>
     <w:basedOn w:val="VerbatimChar"/>
     <w:rPr>
+      <w:rFonts w:ascii="Consolas" w:hAnsi="Consolas"/>
       <w:color w:val="880000"/>
+      <w:sz w:val="22"/>
     </w:rPr>
   </w:style>
   <w:style w:type="character" w:customStyle="1" w:styleId="CharTok">
     <w:name w:val="CharTok"/>
     <w:basedOn w:val="VerbatimChar"/>
     <w:rPr>
-      <w:color w:val="4070a0"/>
+      <w:rFonts w:ascii="Consolas" w:hAnsi="Consolas"/>
+      <w:color w:val="4070A0"/>
+      <w:sz w:val="22"/>
     </w:rPr>
   </w:style>
   <w:style w:type="character" w:customStyle="1" w:styleId="SpecialCharTok">
     <w:name w:val="SpecialCharTok"/>
     <w:basedOn w:val="VerbatimChar"/>
     <w:rPr>
-      <w:color w:val="4070a0"/>
+      <w:rFonts w:ascii="Consolas" w:hAnsi="Consolas"/>
+      <w:color w:val="4070A0"/>
+      <w:sz w:val="22"/>
     </w:rPr>
   </w:style>
   <w:style w:type="character" w:customStyle="1" w:styleId="StringTok">
     <w:name w:val="StringTok"/>
     <w:basedOn w:val="VerbatimChar"/>
     <w:rPr>
-      <w:color w:val="4070a0"/>
+      <w:rFonts w:ascii="Consolas" w:hAnsi="Consolas"/>
+      <w:color w:val="4070A0"/>
+      <w:sz w:val="22"/>
     </w:rPr>
   </w:style>
   <w:style w:type="character" w:customStyle="1" w:styleId="VerbatimStringTok">
     <w:name w:val="VerbatimStringTok"/>
     <w:basedOn w:val="VerbatimChar"/>
     <w:rPr>
-      <w:color w:val="4070a0"/>
+      <w:rFonts w:ascii="Consolas" w:hAnsi="Consolas"/>
+      <w:color w:val="4070A0"/>
+      <w:sz w:val="22"/>
     </w:rPr>
   </w:style>
   <w:style w:type="character" w:customStyle="1" w:styleId="SpecialStringTok">
     <w:name w:val="SpecialStringTok"/>
     <w:basedOn w:val="VerbatimChar"/>
     <w:rPr>
-      <w:color w:val="bb6688"/>
+      <w:rFonts w:ascii="Consolas" w:hAnsi="Consolas"/>
+      <w:color w:val="BB6688"/>
+      <w:sz w:val="22"/>
     </w:rPr>
   </w:style>
   <w:style w:type="character" w:customStyle="1" w:styleId="ImportTok">
     <w:name w:val="ImportTok"/>
     <w:basedOn w:val="VerbatimChar"/>
     <w:rPr>
+      <w:rFonts w:ascii="Consolas" w:hAnsi="Consolas"/>
       <w:b/>
       <w:color w:val="008000"/>
+      <w:sz w:val="22"/>
     </w:rPr>
   </w:style>
   <w:style w:type="character" w:customStyle="1" w:styleId="CommentTok">
     <w:name w:val="CommentTok"/>
     <w:basedOn w:val="VerbatimChar"/>
     <w:rPr>
+      <w:rFonts w:ascii="Consolas" w:hAnsi="Consolas"/>
       <w:i/>
-      <w:color w:val="60a0b0"/>
+      <w:color w:val="60A0B0"/>
+      <w:sz w:val="22"/>
     </w:rPr>
   </w:style>
   <w:style w:type="character" w:customStyle="1" w:styleId="DocumentationTok">
     <w:name w:val="DocumentationTok"/>
     <w:basedOn w:val="VerbatimChar"/>
     <w:rPr>
+      <w:rFonts w:ascii="Consolas" w:hAnsi="Consolas"/>
       <w:i/>
-      <w:color w:val="ba2121"/>
+      <w:color w:val="BA2121"/>
+      <w:sz w:val="22"/>
     </w:rPr>
   </w:style>
   <w:style w:type="character" w:customStyle="1" w:styleId="AnnotationTok">
     <w:name w:val="AnnotationTok"/>
     <w:basedOn w:val="VerbatimChar"/>
     <w:rPr>
+      <w:rFonts w:ascii="Consolas" w:hAnsi="Consolas"/>
       <w:b/>
       <w:i/>
-      <w:color w:val="60a0b0"/>
+      <w:color w:val="60A0B0"/>
+      <w:sz w:val="22"/>
     </w:rPr>
   </w:style>
   <w:style w:type="character" w:customStyle="1" w:styleId="CommentVarTok">
     <w:name w:val="CommentVarTok"/>
     <w:basedOn w:val="VerbatimChar"/>
     <w:rPr>
+      <w:rFonts w:ascii="Consolas" w:hAnsi="Consolas"/>
       <w:b/>
       <w:i/>
-      <w:color w:val="60a0b0"/>
+      <w:color w:val="60A0B0"/>
+      <w:sz w:val="22"/>
     </w:rPr>
   </w:style>
   <w:style w:type="character" w:customStyle="1" w:styleId="OtherTok">
     <w:name w:val="OtherTok"/>
     <w:basedOn w:val="VerbatimChar"/>
     <w:rPr>
+      <w:rFonts w:ascii="Consolas" w:hAnsi="Consolas"/>
       <w:color w:val="007020"/>
+      <w:sz w:val="22"/>
     </w:rPr>
   </w:style>
   <w:style w:type="character" w:customStyle="1" w:styleId="FunctionTok">
     <w:name w:val="FunctionTok"/>
     <w:basedOn w:val="VerbatimChar"/>
     <w:rPr>
-      <w:color w:val="06287e"/>
+      <w:rFonts w:ascii="Consolas" w:hAnsi="Consolas"/>
+      <w:color w:val="06287E"/>
+      <w:sz w:val="22"/>
     </w:rPr>
   </w:style>
   <w:style w:type="character" w:customStyle="1" w:styleId="VariableTok">
     <w:name w:val="VariableTok"/>
     <w:basedOn w:val="VerbatimChar"/>
     <w:rPr>
-      <w:color w:val="19177c"/>
+      <w:rFonts w:ascii="Consolas" w:hAnsi="Consolas"/>
+      <w:color w:val="19177C"/>
+      <w:sz w:val="22"/>
     </w:rPr>
   </w:style>
   <w:style w:type="character" w:customStyle="1" w:styleId="ControlFlowTok">
     <w:name w:val="ControlFlowTok"/>
     <w:basedOn w:val="VerbatimChar"/>
     <w:rPr>
+      <w:rFonts w:ascii="Consolas" w:hAnsi="Consolas"/>
       <w:b/>
       <w:color w:val="007020"/>
+      <w:sz w:val="22"/>
     </w:rPr>
   </w:style>
   <w:style w:type="character" w:customStyle="1" w:styleId="OperatorTok">
     <w:name w:val="OperatorTok"/>
     <w:basedOn w:val="VerbatimChar"/>
     <w:rPr>
+      <w:rFonts w:ascii="Consolas" w:hAnsi="Consolas"/>
       <w:color w:val="666666"/>
+      <w:sz w:val="22"/>
     </w:rPr>
   </w:style>
   <w:style w:type="character" w:customStyle="1" w:styleId="BuiltInTok">
     <w:name w:val="BuiltInTok"/>
     <w:basedOn w:val="VerbatimChar"/>
     <w:rPr>
+      <w:rFonts w:ascii="Consolas" w:hAnsi="Consolas"/>
       <w:color w:val="008000"/>
+      <w:sz w:val="22"/>
     </w:rPr>
   </w:style>
   <w:style w:type="character" w:customStyle="1" w:styleId="ExtensionTok">
     <w:name w:val="ExtensionTok"/>
     <w:basedOn w:val="VerbatimChar"/>
-    <w:rPr/>
+    <w:rPr>
+      <w:rFonts w:ascii="Consolas" w:hAnsi="Consolas"/>
+      <w:sz w:val="22"/>
+    </w:rPr>
   </w:style>
   <w:style w:type="character" w:customStyle="1" w:styleId="PreprocessorTok">
     <w:name w:val="PreprocessorTok"/>
     <w:basedOn w:val="VerbatimChar"/>
     <w:rPr>
-      <w:color w:val="bc7a00"/>
+      <w:rFonts w:ascii="Consolas" w:hAnsi="Consolas"/>
+      <w:color w:val="BC7A00"/>
+      <w:sz w:val="22"/>
     </w:rPr>
   </w:style>
   <w:style w:type="character" w:customStyle="1" w:styleId="AttributeTok">
     <w:name w:val="AttributeTok"/>
     <w:basedOn w:val="VerbatimChar"/>
     <w:rPr>
-      <w:color w:val="7d9029"/>
+      <w:rFonts w:ascii="Consolas" w:hAnsi="Consolas"/>
+      <w:color w:val="7D9029"/>
+      <w:sz w:val="22"/>
     </w:rPr>
   </w:style>
   <w:style w:type="character" w:customStyle="1" w:styleId="RegionMarkerTok">
     <w:name w:val="RegionMarkerTok"/>
     <w:basedOn w:val="VerbatimChar"/>
-    <w:rPr/>
+    <w:rPr>
+      <w:rFonts w:ascii="Consolas" w:hAnsi="Consolas"/>
+      <w:sz w:val="22"/>
+    </w:rPr>
   </w:style>
   <w:style w:type="character" w:customStyle="1" w:styleId="InformationTok">
     <w:name w:val="InformationTok"/>
     <w:basedOn w:val="VerbatimChar"/>
     <w:rPr>
+      <w:rFonts w:ascii="Consolas" w:hAnsi="Consolas"/>
       <w:b/>
       <w:i/>
-      <w:color w:val="60a0b0"/>
+      <w:color w:val="60A0B0"/>
+      <w:sz w:val="22"/>
     </w:rPr>
   </w:style>
   <w:style w:type="character" w:customStyle="1" w:styleId="WarningTok">
     <w:name w:val="WarningTok"/>
     <w:basedOn w:val="VerbatimChar"/>
     <w:rPr>
+      <w:rFonts w:ascii="Consolas" w:hAnsi="Consolas"/>
       <w:b/>
       <w:i/>
-      <w:color w:val="60a0b0"/>
+      <w:color w:val="60A0B0"/>
+      <w:sz w:val="22"/>
     </w:rPr>
   </w:style>
   <w:style w:type="character" w:customStyle="1" w:styleId="AlertTok">
     <w:name w:val="AlertTok"/>
     <w:basedOn w:val="VerbatimChar"/>
     <w:rPr>
+      <w:rFonts w:ascii="Consolas" w:hAnsi="Consolas"/>
       <w:b/>
-      <w:color w:val="ff0000"/>
+      <w:color w:val="FF0000"/>
+      <w:sz w:val="22"/>
     </w:rPr>
   </w:style>
   <w:style w:type="character" w:customStyle="1" w:styleId="ErrorTok">
     <w:name w:val="ErrorTok"/>
     <w:basedOn w:val="VerbatimChar"/>
     <w:rPr>
+      <w:rFonts w:ascii="Consolas" w:hAnsi="Consolas"/>
       <w:b/>
-      <w:color w:val="ff0000"/>
+      <w:color w:val="FF0000"/>
+      <w:sz w:val="22"/>
     </w:rPr>
   </w:style>
   <w:style w:type="character" w:customStyle="1" w:styleId="NormalTok">
     <w:name w:val="NormalTok"/>
     <w:basedOn w:val="VerbatimChar"/>
-    <w:rPr/>
+    <w:rPr>
+      <w:rFonts w:ascii="Consolas" w:hAnsi="Consolas"/>
+      <w:sz w:val="22"/>
+    </w:rPr>
   </w:style>
 </w:styles>
 </file>

</xml_diff>